<commit_message>
Backup 3M working copy and ported revision review
</commit_message>
<xml_diff>
--- a/[05] Documents/01.Draft/IT Project Guidance [36.00-Definition] - System Quality Requirements - Baseline [DRAFT].docx
+++ b/[05] Documents/01.Draft/IT Project Guidance [36.00-Definition] - System Quality Requirements - Baseline [DRAFT].docx
@@ -1,6 +1,6 @@
 
 <file path=word/document.xml><?xml version="1.0" encoding="utf-8"?>
-<w:document xmlns:wpc="http://schemas.microsoft.com/office/word/2010/wordprocessingCanvas" xmlns:cx="http://schemas.microsoft.com/office/drawing/2014/chartex" xmlns:cx1="http://schemas.microsoft.com/office/drawing/2015/9/8/chartex" xmlns:cx2="http://schemas.microsoft.com/office/drawing/2015/10/21/chartex" xmlns:cx3="http://schemas.microsoft.com/office/drawing/2016/5/9/chartex" xmlns:cx4="http://schemas.microsoft.com/office/drawing/2016/5/10/chartex" xmlns:cx5="http://schemas.microsoft.com/office/drawing/2016/5/11/chartex" xmlns:cx6="http://schemas.microsoft.com/office/drawing/2016/5/12/chartex" xmlns:cx7="http://schemas.microsoft.com/office/drawing/2016/5/13/chartex" xmlns:cx8="http://schemas.microsoft.com/office/drawing/2016/5/14/chartex" xmlns:mc="http://schemas.openxmlformats.org/markup-compatibility/2006" xmlns:aink="http://schemas.microsoft.com/office/drawing/2016/ink" xmlns:am3d="http://schemas.microsoft.com/office/drawing/2017/model3d" xmlns:o="urn:schemas-microsoft-com:office:office" xmlns:oel="http://schemas.microsoft.com/office/2019/extlst" xmlns:r="http://schemas.openxmlformats.org/officeDocument/2006/relationships" xmlns:m="http://schemas.openxmlformats.org/officeDocument/2006/math" xmlns:v="urn:schemas-microsoft-com:vml" xmlns:wp14="http://schemas.microsoft.com/office/word/2010/wordprocessingDrawing" xmlns:wp="http://schemas.openxmlformats.org/drawingml/2006/wordprocessingDrawing" xmlns:w10="urn:schemas-microsoft-com:office:word" xmlns:w="http://schemas.openxmlformats.org/wordprocessingml/2006/main" xmlns:w14="http://schemas.microsoft.com/office/word/2010/wordml" xmlns:w15="http://schemas.microsoft.com/office/word/2012/wordml" xmlns:w16cex="http://schemas.microsoft.com/office/word/2018/wordml/cex" xmlns:w16cid="http://schemas.microsoft.com/office/word/2016/wordml/cid" xmlns:w16="http://schemas.microsoft.com/office/word/2018/wordml" xmlns:w16sdtdh="http://schemas.microsoft.com/office/word/2020/wordml/sdtdatahash" xmlns:w16se="http://schemas.microsoft.com/office/word/2015/wordml/symex" xmlns:wpg="http://schemas.microsoft.com/office/word/2010/wordprocessingGroup" xmlns:wpi="http://schemas.microsoft.com/office/word/2010/wordprocessingInk" xmlns:wne="http://schemas.microsoft.com/office/word/2006/wordml" xmlns:wps="http://schemas.microsoft.com/office/word/2010/wordprocessingShape" mc:Ignorable="w14 w15 w16se w16cid w16 w16cex w16sdtdh wp14">
+<w:document xmlns:wpc="http://schemas.microsoft.com/office/word/2010/wordprocessingCanvas" xmlns:cx="http://schemas.microsoft.com/office/drawing/2014/chartex" xmlns:cx1="http://schemas.microsoft.com/office/drawing/2015/9/8/chartex" xmlns:cx2="http://schemas.microsoft.com/office/drawing/2015/10/21/chartex" xmlns:cx3="http://schemas.microsoft.com/office/drawing/2016/5/9/chartex" xmlns:cx4="http://schemas.microsoft.com/office/drawing/2016/5/10/chartex" xmlns:cx5="http://schemas.microsoft.com/office/drawing/2016/5/11/chartex" xmlns:cx6="http://schemas.microsoft.com/office/drawing/2016/5/12/chartex" xmlns:cx7="http://schemas.microsoft.com/office/drawing/2016/5/13/chartex" xmlns:cx8="http://schemas.microsoft.com/office/drawing/2016/5/14/chartex" xmlns:mc="http://schemas.openxmlformats.org/markup-compatibility/2006" xmlns:aink="http://schemas.microsoft.com/office/drawing/2016/ink" xmlns:am3d="http://schemas.microsoft.com/office/drawing/2017/model3d" xmlns:o="urn:schemas-microsoft-com:office:office" xmlns:oel="http://schemas.microsoft.com/office/2019/extlst" xmlns:r="http://schemas.openxmlformats.org/officeDocument/2006/relationships" xmlns:m="http://schemas.openxmlformats.org/officeDocument/2006/math" xmlns:v="urn:schemas-microsoft-com:vml" xmlns:wp14="http://schemas.microsoft.com/office/word/2010/wordprocessingDrawing" xmlns:wp="http://schemas.openxmlformats.org/drawingml/2006/wordprocessingDrawing" xmlns:w10="urn:schemas-microsoft-com:office:word" xmlns:w="http://schemas.openxmlformats.org/wordprocessingml/2006/main" xmlns:w14="http://schemas.microsoft.com/office/word/2010/wordml" xmlns:w15="http://schemas.microsoft.com/office/word/2012/wordml" xmlns:w16cex="http://schemas.microsoft.com/office/word/2018/wordml/cex" xmlns:w16cid="http://schemas.microsoft.com/office/word/2016/wordml/cid" xmlns:w16="http://schemas.microsoft.com/office/word/2018/wordml" xmlns:w16du="http://schemas.microsoft.com/office/word/2023/wordml/word16du" xmlns:w16sdtdh="http://schemas.microsoft.com/office/word/2020/wordml/sdtdatahash" xmlns:w16sdtfl="http://schemas.microsoft.com/office/word/2024/wordml/sdtformatlock" xmlns:w16se="http://schemas.microsoft.com/office/word/2015/wordml/symex" xmlns:wpg="http://schemas.microsoft.com/office/word/2010/wordprocessingGroup" xmlns:wpi="http://schemas.microsoft.com/office/word/2010/wordprocessingInk" xmlns:wne="http://schemas.microsoft.com/office/word/2006/wordml" xmlns:wps="http://schemas.microsoft.com/office/word/2010/wordprocessingShape" mc:Ignorable="w14 w15 w16se w16cid w16 w16cex w16sdtdh w16sdtfl w16du wp14">
   <w:body>
     <w:p>
       <w:pPr>
@@ -7836,27 +7836,14 @@
       <w:r>
         <w:t xml:space="preserve">Figure </w:t>
       </w:r>
-      <w:r>
-        <w:fldChar w:fldCharType="begin"/>
-      </w:r>
-      <w:r>
-        <w:instrText xml:space="preserve"> SEQ Figure \* ARABIC </w:instrText>
-      </w:r>
-      <w:r>
-        <w:fldChar w:fldCharType="separate"/>
-      </w:r>
-      <w:r>
-        <w:rPr>
-          <w:noProof/>
-        </w:rPr>
-        <w:t>8</w:t>
-      </w:r>
-      <w:r>
-        <w:rPr>
-          <w:noProof/>
-        </w:rPr>
-        <w:fldChar w:fldCharType="end"/>
-      </w:r>
+      <w:fldSimple w:instr=" SEQ Figure \* ARABIC ">
+        <w:r>
+          <w:rPr>
+            <w:noProof/>
+          </w:rPr>
+          <w:t>8</w:t>
+        </w:r>
+      </w:fldSimple>
       <w:r>
         <w:t>: Default System Base Tier of Quality Requirements</w:t>
       </w:r>
@@ -8248,7 +8235,15 @@
             </w:r>
             <w:proofErr w:type="gramEnd"/>
             <w:r>
-              <w:t xml:space="preserve"> of meeting defined objectives.</w:t>
+              <w:t xml:space="preserve"> of meeting defined </w:t>
+            </w:r>
+            <w:proofErr w:type="gramStart"/>
+            <w:r>
+              <w:t>objectives</w:t>
+            </w:r>
+            <w:proofErr w:type="gramEnd"/>
+            <w:r>
+              <w:t>.</w:t>
             </w:r>
           </w:p>
         </w:tc>
@@ -8643,13 +8638,27 @@
               <w:rPr>
                 <w:lang w:eastAsia="en-NZ"/>
               </w:rPr>
-              <w:t xml:space="preserve">C&amp;A Specialists require secure development, deployment and operations practices </w:t>
+              <w:t xml:space="preserve">C&amp;A Specialists require secure development, </w:t>
             </w:r>
             <w:proofErr w:type="gramStart"/>
             <w:r>
               <w:rPr>
                 <w:lang w:eastAsia="en-NZ"/>
               </w:rPr>
+              <w:t>deployment</w:t>
+            </w:r>
+            <w:proofErr w:type="gramEnd"/>
+            <w:r>
+              <w:rPr>
+                <w:lang w:eastAsia="en-NZ"/>
+              </w:rPr>
+              <w:t xml:space="preserve"> and operations practices </w:t>
+            </w:r>
+            <w:proofErr w:type="gramStart"/>
+            <w:r>
+              <w:rPr>
+                <w:lang w:eastAsia="en-NZ"/>
+              </w:rPr>
               <w:t>in order to</w:t>
             </w:r>
             <w:proofErr w:type="gramEnd"/>
@@ -8657,7 +8666,21 @@
               <w:rPr>
                 <w:lang w:eastAsia="en-NZ"/>
               </w:rPr>
-              <w:t xml:space="preserve"> permit the solution to go and stay Live,</w:t>
+              <w:t xml:space="preserve"> </w:t>
+            </w:r>
+            <w:proofErr w:type="gramStart"/>
+            <w:r>
+              <w:rPr>
+                <w:lang w:eastAsia="en-NZ"/>
+              </w:rPr>
+              <w:t>permit</w:t>
+            </w:r>
+            <w:proofErr w:type="gramEnd"/>
+            <w:r>
+              <w:rPr>
+                <w:lang w:eastAsia="en-NZ"/>
+              </w:rPr>
+              <w:t xml:space="preserve"> the solution to go and stay Live,</w:t>
             </w:r>
           </w:p>
           <w:p>
@@ -9527,7 +9550,23 @@
           <w:i/>
           <w:iCs/>
         </w:rPr>
-        <w:t xml:space="preserve">performance relative to the </w:t>
+        <w:t xml:space="preserve">performance </w:t>
+      </w:r>
+      <w:proofErr w:type="gramStart"/>
+      <w:r>
+        <w:rPr>
+          <w:i/>
+          <w:iCs/>
+        </w:rPr>
+        <w:t>relative</w:t>
+      </w:r>
+      <w:proofErr w:type="gramEnd"/>
+      <w:r>
+        <w:rPr>
+          <w:i/>
+          <w:iCs/>
+        </w:rPr>
+        <w:t xml:space="preserve"> to the </w:t>
       </w:r>
       <w:proofErr w:type="gramStart"/>
       <w:r>
@@ -11807,7 +11846,21 @@
               <w:rPr>
                 <w:lang w:eastAsia="en-NZ"/>
               </w:rPr>
-              <w:t xml:space="preserve"> to not impact end users</w:t>
+              <w:t xml:space="preserve"> to not </w:t>
+            </w:r>
+            <w:proofErr w:type="gramStart"/>
+            <w:r>
+              <w:rPr>
+                <w:lang w:eastAsia="en-NZ"/>
+              </w:rPr>
+              <w:t>impact</w:t>
+            </w:r>
+            <w:proofErr w:type="gramEnd"/>
+            <w:r>
+              <w:rPr>
+                <w:lang w:eastAsia="en-NZ"/>
+              </w:rPr>
+              <w:t xml:space="preserve"> end users</w:t>
             </w:r>
           </w:p>
         </w:tc>
@@ -12444,15 +12497,31 @@
               <w:t>MUST</w:t>
             </w:r>
             <w:r>
-              <w:t xml:space="preserve"> permit the extraction of </w:t>
+              <w:t xml:space="preserve"> </w:t>
             </w:r>
             <w:proofErr w:type="gramStart"/>
             <w:r>
+              <w:t>permit</w:t>
+            </w:r>
+            <w:proofErr w:type="gramEnd"/>
+            <w:r>
+              <w:t xml:space="preserve"> the extraction of </w:t>
+            </w:r>
+            <w:proofErr w:type="gramStart"/>
+            <w:r>
               <w:t>the vast majority of</w:t>
             </w:r>
             <w:proofErr w:type="gramEnd"/>
             <w:r>
-              <w:t xml:space="preserve"> system managed resources, metadata and relationships via APIs.</w:t>
+              <w:t xml:space="preserve"> system managed resources, </w:t>
+            </w:r>
+            <w:proofErr w:type="gramStart"/>
+            <w:r>
+              <w:t>metadata</w:t>
+            </w:r>
+            <w:proofErr w:type="gramEnd"/>
+            <w:r>
+              <w:t xml:space="preserve"> and relationships via APIs.</w:t>
             </w:r>
           </w:p>
         </w:tc>
@@ -12570,7 +12639,15 @@
             </w:r>
             <w:proofErr w:type="gramEnd"/>
             <w:r>
-              <w:t xml:space="preserve"> extracting data, and not be simply reused UX (e.g. limited to looking at one group/tenant at a time) or Reporting APIs (hopefully provided secure aggregated views, but this is insufficient to extract data into another system for Business Continuity purposes).</w:t>
+              <w:t xml:space="preserve"> extracting data, and not be simply reused UX (e.g. limited to looking at one group/tenant at a time) or Reporting APIs (hopefully </w:t>
+            </w:r>
+            <w:proofErr w:type="gramStart"/>
+            <w:r>
+              <w:t>provided</w:t>
+            </w:r>
+            <w:proofErr w:type="gramEnd"/>
+            <w:r>
+              <w:t xml:space="preserve"> secure aggregated views, but this is insufficient to extract data into another system for Business Continuity purposes).</w:t>
             </w:r>
           </w:p>
         </w:tc>
@@ -14490,8 +14567,13 @@
               <w:t>Services</w:t>
             </w:r>
             <w:r>
-              <w:t xml:space="preserve"> is</w:t>
-            </w:r>
+              <w:t xml:space="preserve"> </w:t>
+            </w:r>
+            <w:proofErr w:type="gramStart"/>
+            <w:r>
+              <w:t>is</w:t>
+            </w:r>
+            <w:proofErr w:type="gramEnd"/>
             <w:r>
               <w:t xml:space="preserve"> to remain</w:t>
             </w:r>
@@ -14670,11 +14752,11 @@
             </w:r>
             <w:proofErr w:type="gramStart"/>
             <w:r>
-              <w:t>is capable of using</w:t>
+              <w:t>is</w:t>
             </w:r>
             <w:proofErr w:type="gramEnd"/>
             <w:r>
-              <w:t xml:space="preserve"> language packs to localize the user interface's images and text.</w:t>
+              <w:t xml:space="preserve"> capable of using language packs to localize the user interface's images and text.</w:t>
             </w:r>
           </w:p>
           <w:p>
@@ -16266,7 +16348,15 @@
             </w:r>
             <w:proofErr w:type="gramEnd"/>
             <w:r>
-              <w:t xml:space="preserve"> ensure their knowledge is not lost, documentation is required.</w:t>
+              <w:t xml:space="preserve"> ensure their knowledge is not lost, documentation is </w:t>
+            </w:r>
+            <w:proofErr w:type="gramStart"/>
+            <w:r>
+              <w:t>required</w:t>
+            </w:r>
+            <w:proofErr w:type="gramEnd"/>
+            <w:r>
+              <w:t>.</w:t>
             </w:r>
           </w:p>
           <w:p>
@@ -18183,11 +18273,7 @@
           </w:p>
           <w:p>
             <w:r>
-              <w:t xml:space="preserve">Free form text-based search capabilities (as opposed to requiring </w:t>
-            </w:r>
-            <w:r>
-              <w:lastRenderedPageBreak/>
-              <w:t>dropdowns to filter) are a real benefit.</w:t>
+              <w:t>Free form text-based search capabilities (as opposed to requiring dropdowns to filter) are a real benefit.</w:t>
             </w:r>
           </w:p>
         </w:tc>
@@ -18205,7 +18291,6 @@
               <w:rPr>
                 <w:lang w:eastAsia="en-NZ"/>
               </w:rPr>
-              <w:lastRenderedPageBreak/>
               <w:t>Services</w:t>
             </w:r>
             <w:r>
@@ -18648,14 +18733,7 @@
               <w:rPr>
                 <w:lang w:eastAsia="en-NZ"/>
               </w:rPr>
-              <w:t xml:space="preserve"> by information received from another service (AD, AAD, IdP), but </w:t>
-            </w:r>
-            <w:r>
-              <w:rPr>
-                <w:lang w:eastAsia="en-NZ"/>
-              </w:rPr>
-              <w:lastRenderedPageBreak/>
-              <w:t>the system must be able to manage these services on its own (with its own API and GUI views, etc).</w:t>
+              <w:t xml:space="preserve"> by information received from another service (AD, AAD, IdP), but the system must be able to manage these services on its own (with its own API and GUI views, etc).</w:t>
             </w:r>
             <w:r>
               <w:rPr>
@@ -18800,12 +18878,26 @@
               <w:rPr>
                 <w:lang w:eastAsia="en-NZ"/>
               </w:rPr>
-              <w:t xml:space="preserve"> permit linking to one or more Disclosure statements:</w:t>
-            </w:r>
+              <w:t xml:space="preserve"> </w:t>
+            </w:r>
+            <w:proofErr w:type="gramStart"/>
             <w:r>
               <w:rPr>
                 <w:lang w:eastAsia="en-NZ"/>
               </w:rPr>
+              <w:t>permit</w:t>
+            </w:r>
+            <w:proofErr w:type="gramEnd"/>
+            <w:r>
+              <w:rPr>
+                <w:lang w:eastAsia="en-NZ"/>
+              </w:rPr>
+              <w:t xml:space="preserve"> linking to one or more Disclosure statements:</w:t>
+            </w:r>
+            <w:r>
+              <w:rPr>
+                <w:lang w:eastAsia="en-NZ"/>
+              </w:rPr>
               <w:br/>
             </w:r>
             <w:proofErr w:type="gramStart"/>
@@ -18852,7 +18944,21 @@
               <w:rPr>
                 <w:lang w:eastAsia="en-NZ"/>
               </w:rPr>
-              <w:t xml:space="preserve">Solutions must disclose to end </w:t>
+              <w:t xml:space="preserve">Solutions must </w:t>
+            </w:r>
+            <w:proofErr w:type="gramStart"/>
+            <w:r>
+              <w:rPr>
+                <w:lang w:eastAsia="en-NZ"/>
+              </w:rPr>
+              <w:t>disclose</w:t>
+            </w:r>
+            <w:proofErr w:type="gramEnd"/>
+            <w:r>
+              <w:rPr>
+                <w:lang w:eastAsia="en-NZ"/>
+              </w:rPr>
+              <w:t xml:space="preserve"> to end </w:t>
             </w:r>
             <w:proofErr w:type="gramStart"/>
             <w:r>
@@ -19826,19 +19932,12 @@
               <w:rPr>
                 <w:highlight w:val="yellow"/>
               </w:rPr>
-              <w:t>QR-DEF-</w:t>
+              <w:t>QR-DEF-USA-</w:t>
             </w:r>
             <w:r>
               <w:rPr>
                 <w:highlight w:val="yellow"/>
               </w:rPr>
-              <w:lastRenderedPageBreak/>
-              <w:t>USA-</w:t>
-            </w:r>
-            <w:r>
-              <w:rPr>
-                <w:highlight w:val="yellow"/>
-              </w:rPr>
               <w:br/>
               <w:t>00</w:t>
             </w:r>
@@ -19850,7 +19949,6 @@
           </w:tcPr>
           <w:p>
             <w:r>
-              <w:lastRenderedPageBreak/>
               <w:t>Default/</w:t>
             </w:r>
             <w:r>
@@ -19859,11 +19957,7 @@
             </w:r>
             <w:r>
               <w:br/>
-              <w:t>Accessibilit</w:t>
-            </w:r>
-            <w:r>
-              <w:lastRenderedPageBreak/>
-              <w:t>y/</w:t>
+              <w:t>Accessibility/</w:t>
             </w:r>
             <w:r>
               <w:br/>
@@ -19886,7 +19980,6 @@
               <w:rPr>
                 <w:lang w:eastAsia="en-NZ"/>
               </w:rPr>
-              <w:lastRenderedPageBreak/>
               <w:t xml:space="preserve">Service Graphical User Interfaces (GUI) </w:t>
             </w:r>
             <w:r>
@@ -19899,77 +19992,57 @@
               <w:rPr>
                 <w:lang w:eastAsia="en-NZ"/>
               </w:rPr>
-              <w:t xml:space="preserve"> meet WCAG </w:t>
-            </w:r>
+              <w:t xml:space="preserve"> meet WCAG 2.2 standards to </w:t>
+            </w:r>
+            <w:proofErr w:type="gramStart"/>
             <w:r>
               <w:rPr>
                 <w:lang w:eastAsia="en-NZ"/>
               </w:rPr>
-              <w:lastRenderedPageBreak/>
-              <w:t xml:space="preserve">2.2 standards to </w:t>
-            </w:r>
-            <w:proofErr w:type="gramStart"/>
+              <w:t>an</w:t>
+            </w:r>
+            <w:proofErr w:type="gramEnd"/>
             <w:r>
               <w:rPr>
                 <w:lang w:eastAsia="en-NZ"/>
               </w:rPr>
-              <w:t>an</w:t>
-            </w:r>
-            <w:proofErr w:type="gramEnd"/>
+              <w:t xml:space="preserve"> Level AA or higher.</w:t>
+            </w:r>
+          </w:p>
+        </w:tc>
+        <w:tc>
+          <w:tcPr>
+            <w:tcW w:w="1985" w:type="dxa"/>
+          </w:tcPr>
+          <w:p>
+            <w:r>
+              <w:t>Services must be usable by visually impaired users.</w:t>
+            </w:r>
+          </w:p>
+        </w:tc>
+        <w:tc>
+          <w:tcPr>
+            <w:tcW w:w="1984" w:type="dxa"/>
+          </w:tcPr>
+          <w:p>
+            <w:r>
+              <w:t>Sighting of a report summarising the score</w:t>
+            </w:r>
+            <w:r>
+              <w:t xml:space="preserve"> of the system, and it’s achieving a Level AA or better.</w:t>
+            </w:r>
+          </w:p>
+        </w:tc>
+        <w:tc>
+          <w:tcPr>
+            <w:tcW w:w="1985" w:type="dxa"/>
+          </w:tcPr>
+          <w:p>
             <w:r>
               <w:rPr>
                 <w:lang w:eastAsia="en-NZ"/>
               </w:rPr>
-              <w:t xml:space="preserve"> Level AA or higher.</w:t>
-            </w:r>
-          </w:p>
-        </w:tc>
-        <w:tc>
-          <w:tcPr>
-            <w:tcW w:w="1985" w:type="dxa"/>
-          </w:tcPr>
-          <w:p>
-            <w:r>
-              <w:lastRenderedPageBreak/>
-              <w:t>Services must be usable by visually impaired users.</w:t>
-            </w:r>
-          </w:p>
-        </w:tc>
-        <w:tc>
-          <w:tcPr>
-            <w:tcW w:w="1984" w:type="dxa"/>
-          </w:tcPr>
-          <w:p>
-            <w:r>
-              <w:t>Sighting of a report summarising the score</w:t>
-            </w:r>
-            <w:r>
-              <w:t xml:space="preserve"> of the </w:t>
-            </w:r>
-            <w:r>
-              <w:lastRenderedPageBreak/>
-              <w:t>system, and it’s achieving a Level AA or better.</w:t>
-            </w:r>
-          </w:p>
-        </w:tc>
-        <w:tc>
-          <w:tcPr>
-            <w:tcW w:w="1985" w:type="dxa"/>
-          </w:tcPr>
-          <w:p>
-            <w:r>
-              <w:rPr>
-                <w:lang w:eastAsia="en-NZ"/>
-              </w:rPr>
-              <w:lastRenderedPageBreak/>
-              <w:t xml:space="preserve">The organisation of data for WCAG impacts other </w:t>
-            </w:r>
-            <w:r>
-              <w:rPr>
-                <w:lang w:eastAsia="en-NZ"/>
-              </w:rPr>
-              <w:lastRenderedPageBreak/>
-              <w:t>positive outcomes. Notable succinctness of interfaces, organised repeated layout patterns, etc.</w:t>
+              <w:t>The organisation of data for WCAG impacts other positive outcomes. Notable succinctness of interfaces, organised repeated layout patterns, etc.</w:t>
             </w:r>
             <w:r>
               <w:rPr>
@@ -20375,18 +20448,12 @@
                 <w:highlight w:val="yellow"/>
               </w:rPr>
               <w:br/>
+              <w:t>USA-</w:t>
             </w:r>
             <w:r>
               <w:rPr>
                 <w:highlight w:val="yellow"/>
               </w:rPr>
-              <w:lastRenderedPageBreak/>
-              <w:t>USA-</w:t>
-            </w:r>
-            <w:r>
-              <w:rPr>
-                <w:highlight w:val="yellow"/>
-              </w:rPr>
               <w:br/>
               <w:t>00</w:t>
             </w:r>
@@ -20398,16 +20465,11 @@
           </w:tcPr>
           <w:p>
             <w:r>
-              <w:lastRenderedPageBreak/>
               <w:t>Usability/</w:t>
             </w:r>
             <w:r>
               <w:br/>
-              <w:t>Accessibilit</w:t>
-            </w:r>
-            <w:r>
-              <w:lastRenderedPageBreak/>
-              <w:t>y/</w:t>
+              <w:t>Accessibility/</w:t>
             </w:r>
             <w:r>
               <w:br/>
@@ -20425,7 +20487,6 @@
               <w:rPr>
                 <w:lang w:eastAsia="en-NZ"/>
               </w:rPr>
-              <w:lastRenderedPageBreak/>
               <w:t xml:space="preserve">Universal Design Principles </w:t>
             </w:r>
             <w:r>
@@ -20438,46 +20499,32 @@
               <w:rPr>
                 <w:lang w:eastAsia="en-NZ"/>
               </w:rPr>
-              <w:t xml:space="preserve"> be </w:t>
-            </w:r>
+              <w:t xml:space="preserve"> be adhered to when developing custom interfaces.</w:t>
+            </w:r>
+          </w:p>
+        </w:tc>
+        <w:tc>
+          <w:tcPr>
+            <w:tcW w:w="1985" w:type="dxa"/>
+          </w:tcPr>
+          <w:p/>
+        </w:tc>
+        <w:tc>
+          <w:tcPr>
+            <w:tcW w:w="1984" w:type="dxa"/>
+          </w:tcPr>
+          <w:p/>
+        </w:tc>
+        <w:tc>
+          <w:tcPr>
+            <w:tcW w:w="1985" w:type="dxa"/>
+          </w:tcPr>
+          <w:p>
             <w:r>
               <w:rPr>
                 <w:lang w:eastAsia="en-NZ"/>
               </w:rPr>
-              <w:lastRenderedPageBreak/>
-              <w:t>adhered to when developing custom interfaces.</w:t>
-            </w:r>
-          </w:p>
-        </w:tc>
-        <w:tc>
-          <w:tcPr>
-            <w:tcW w:w="1985" w:type="dxa"/>
-          </w:tcPr>
-          <w:p/>
-        </w:tc>
-        <w:tc>
-          <w:tcPr>
-            <w:tcW w:w="1984" w:type="dxa"/>
-          </w:tcPr>
-          <w:p/>
-        </w:tc>
-        <w:tc>
-          <w:tcPr>
-            <w:tcW w:w="1985" w:type="dxa"/>
-          </w:tcPr>
-          <w:p>
-            <w:r>
-              <w:rPr>
-                <w:lang w:eastAsia="en-NZ"/>
-              </w:rPr>
-              <w:t xml:space="preserve">Universal Design is the design and </w:t>
-            </w:r>
-            <w:r>
-              <w:rPr>
-                <w:lang w:eastAsia="en-NZ"/>
-              </w:rPr>
-              <w:lastRenderedPageBreak/>
-              <w:t>composition of an environment so that it can be accessed, understood and used to the greatest extent possible by all people regardless of their age, size, ability or disability. If an environment is accessible, usable, convenient and a pleasure to use, everyone benefits.</w:t>
+              <w:t>Universal Design is the design and composition of an environment so that it can be accessed, understood and used to the greatest extent possible by all people regardless of their age, size, ability or disability. If an environment is accessible, usable, convenient and a pleasure to use, everyone benefits.</w:t>
             </w:r>
           </w:p>
         </w:tc>
@@ -20705,7 +20752,23 @@
           <w:i/>
           <w:iCs/>
         </w:rPr>
-        <w:t xml:space="preserve">Degree to which a system, product or component performs specified functions under specified conditions for a specified </w:t>
+        <w:t xml:space="preserve">Degree to which a system, product or </w:t>
+      </w:r>
+      <w:proofErr w:type="gramStart"/>
+      <w:r>
+        <w:rPr>
+          <w:i/>
+          <w:iCs/>
+        </w:rPr>
+        <w:t>component</w:t>
+      </w:r>
+      <w:proofErr w:type="gramEnd"/>
+      <w:r>
+        <w:rPr>
+          <w:i/>
+          <w:iCs/>
+        </w:rPr>
+        <w:t xml:space="preserve"> performs specified functions under specified conditions for a specified </w:t>
       </w:r>
       <w:proofErr w:type="gramStart"/>
       <w:r>
@@ -20750,7 +20813,6 @@
       </w:pPr>
       <w:bookmarkStart w:id="51" w:name="_Toc156204945"/>
       <w:r>
-        <w:lastRenderedPageBreak/>
         <w:t>Maturity</w:t>
       </w:r>
       <w:bookmarkEnd w:id="51"/>
@@ -21245,11 +21307,23 @@
             </w:r>
             <w:proofErr w:type="gramEnd"/>
             <w:r>
-              <w:t xml:space="preserve"> and it is virtually certain that a solution has to be </w:t>
-            </w:r>
-            <w:r>
-              <w:lastRenderedPageBreak/>
-              <w:t>capable of running on different OSs.</w:t>
+              <w:t xml:space="preserve"> and it is </w:t>
+            </w:r>
+            <w:proofErr w:type="gramStart"/>
+            <w:r>
+              <w:t>virtually certain</w:t>
+            </w:r>
+            <w:proofErr w:type="gramEnd"/>
+            <w:r>
+              <w:t xml:space="preserve"> that a solution </w:t>
+            </w:r>
+            <w:proofErr w:type="gramStart"/>
+            <w:r>
+              <w:t>has to</w:t>
+            </w:r>
+            <w:proofErr w:type="gramEnd"/>
+            <w:r>
+              <w:t xml:space="preserve"> be capable of running on different OSs.</w:t>
             </w:r>
           </w:p>
         </w:tc>
@@ -21273,11 +21347,7 @@
           </w:p>
           <w:p>
             <w:r>
-              <w:t xml:space="preserve">.NET Core (as opposed to the older Windows </w:t>
-            </w:r>
-            <w:r>
-              <w:lastRenderedPageBreak/>
-              <w:t>specific .NET Classic Framework)</w:t>
+              <w:t>.NET Core (as opposed to the older Windows specific .NET Classic Framework)</w:t>
             </w:r>
           </w:p>
           <w:p>
@@ -21411,11 +21481,11 @@
             </w:r>
             <w:proofErr w:type="gramStart"/>
             <w:r>
-              <w:t>is capable of working</w:t>
+              <w:t>is</w:t>
             </w:r>
             <w:proofErr w:type="gramEnd"/>
             <w:r>
-              <w:t xml:space="preserve"> if caching is unable to work.</w:t>
+              <w:t xml:space="preserve"> capable of working if caching is unable to work.</w:t>
             </w:r>
           </w:p>
           <w:p>
@@ -21690,34 +21760,26 @@
               <w:rPr>
                 <w:lang w:eastAsia="en-NZ"/>
               </w:rPr>
-              <w:t xml:space="preserve">based on the CPU being consumed at higher </w:t>
+              <w:t>based on the CPU being consumed at higher than a specified %, for longer than a specified duration</w:t>
             </w:r>
             <w:r>
               <w:rPr>
                 <w:lang w:eastAsia="en-NZ"/>
               </w:rPr>
-              <w:lastRenderedPageBreak/>
-              <w:t>than a specified %, for longer than a specified duration</w:t>
-            </w:r>
+              <w:t>, scaling down later based on another CPU % value.</w:t>
+            </w:r>
+          </w:p>
+        </w:tc>
+        <w:tc>
+          <w:tcPr>
+            <w:tcW w:w="1985" w:type="dxa"/>
+            <w:hideMark/>
+          </w:tcPr>
+          <w:p>
             <w:r>
               <w:rPr>
                 <w:lang w:eastAsia="en-NZ"/>
               </w:rPr>
-              <w:t>, scaling down later based on another CPU % value.</w:t>
-            </w:r>
-          </w:p>
-        </w:tc>
-        <w:tc>
-          <w:tcPr>
-            <w:tcW w:w="1985" w:type="dxa"/>
-            <w:hideMark/>
-          </w:tcPr>
-          <w:p>
-            <w:r>
-              <w:rPr>
-                <w:lang w:eastAsia="en-NZ"/>
-              </w:rPr>
-              <w:lastRenderedPageBreak/>
               <w:t>The system must be capable of running economically when not in demand, while not compromising its ability to meet projected peak demand.</w:t>
             </w:r>
           </w:p>
@@ -21928,11 +21990,7 @@
               <w:t>Services</w:t>
             </w:r>
             <w:r>
-              <w:t xml:space="preserve"> uses caching to limit the number of threads required to </w:t>
-            </w:r>
-            <w:r>
-              <w:lastRenderedPageBreak/>
-              <w:t>communicate across tiers to the database to diminish the chance of it becoming a bottleneck.</w:t>
+              <w:t xml:space="preserve"> uses caching to limit the number of threads required to communicate across tiers to the database to diminish the chance of it becoming a bottleneck.</w:t>
             </w:r>
           </w:p>
           <w:p>
@@ -22099,58 +22157,44 @@
               <w:rPr>
                 <w:lang w:eastAsia="en-NZ"/>
               </w:rPr>
-              <w:t xml:space="preserve">as to when solution capabilities and </w:t>
+              <w:t>as to when solution capabilities and components will be rendered inaccessible</w:t>
             </w:r>
             <w:r>
               <w:rPr>
                 <w:lang w:eastAsia="en-NZ"/>
               </w:rPr>
-              <w:lastRenderedPageBreak/>
-              <w:t>components will be rendered inaccessible</w:t>
+              <w:t>, and for how long (while continuing to meet MTD expectations)</w:t>
             </w:r>
             <w:r>
               <w:rPr>
                 <w:lang w:eastAsia="en-NZ"/>
               </w:rPr>
-              <w:t>, and for how long (while continuing to meet MTD expectations)</w:t>
-            </w:r>
+              <w:t>. </w:t>
+            </w:r>
+          </w:p>
+        </w:tc>
+        <w:tc>
+          <w:tcPr>
+            <w:tcW w:w="1985" w:type="dxa"/>
+          </w:tcPr>
+          <w:p/>
+        </w:tc>
+        <w:tc>
+          <w:tcPr>
+            <w:tcW w:w="1984" w:type="dxa"/>
+          </w:tcPr>
+          <w:p/>
+        </w:tc>
+        <w:tc>
+          <w:tcPr>
+            <w:tcW w:w="1985" w:type="dxa"/>
+          </w:tcPr>
+          <w:p>
             <w:r>
               <w:rPr>
                 <w:lang w:eastAsia="en-NZ"/>
               </w:rPr>
-              <w:t>. </w:t>
-            </w:r>
-          </w:p>
-        </w:tc>
-        <w:tc>
-          <w:tcPr>
-            <w:tcW w:w="1985" w:type="dxa"/>
-          </w:tcPr>
-          <w:p/>
-        </w:tc>
-        <w:tc>
-          <w:tcPr>
-            <w:tcW w:w="1984" w:type="dxa"/>
-          </w:tcPr>
-          <w:p/>
-        </w:tc>
-        <w:tc>
-          <w:tcPr>
-            <w:tcW w:w="1985" w:type="dxa"/>
-          </w:tcPr>
-          <w:p>
-            <w:r>
-              <w:rPr>
-                <w:lang w:eastAsia="en-NZ"/>
-              </w:rPr>
-              <w:t xml:space="preserve">Users require foreknowledge, and Support specialists require foreknowledge as to when users may inquire as to </w:t>
-            </w:r>
-            <w:r>
-              <w:rPr>
-                <w:lang w:eastAsia="en-NZ"/>
-              </w:rPr>
-              <w:lastRenderedPageBreak/>
-              <w:t>why a service is no available.  </w:t>
+              <w:t>Users require foreknowledge, and Support specialists require foreknowledge as to when users may inquire as to why a service is no available.  </w:t>
             </w:r>
           </w:p>
         </w:tc>
@@ -22674,11 +22718,7 @@
           </w:tcPr>
           <w:p>
             <w:r>
-              <w:t>QR-DEF-</w:t>
-            </w:r>
-            <w:r>
-              <w:lastRenderedPageBreak/>
-              <w:t>REL-</w:t>
+              <w:t>QR-DEF-REL-</w:t>
             </w:r>
             <w:r>
               <w:br/>
@@ -22699,7 +22739,6 @@
           </w:tcPr>
           <w:p>
             <w:r>
-              <w:lastRenderedPageBreak/>
               <w:t>Default/</w:t>
             </w:r>
             <w:r>
@@ -22714,7 +22753,6 @@
               <w:br/>
             </w:r>
             <w:r>
-              <w:lastRenderedPageBreak/>
               <w:t>Geo Resilience</w:t>
             </w:r>
           </w:p>
@@ -22726,7 +22764,6 @@
           </w:tcPr>
           <w:p>
             <w:r>
-              <w:lastRenderedPageBreak/>
               <w:t>Services</w:t>
             </w:r>
             <w:r>
@@ -22747,11 +22784,7 @@
             </w:r>
             <w:proofErr w:type="gramEnd"/>
             <w:r>
-              <w:t xml:space="preserve"> it is resilient </w:t>
-            </w:r>
-            <w:r>
-              <w:lastRenderedPageBreak/>
-              <w:t>against unavailability of infrastructure in the default area.</w:t>
+              <w:t xml:space="preserve"> it is resilient against unavailability of infrastructure in the default area.</w:t>
             </w:r>
           </w:p>
         </w:tc>
@@ -22762,12 +22795,7 @@
           </w:tcPr>
           <w:p>
             <w:r>
-              <w:lastRenderedPageBreak/>
-              <w:t xml:space="preserve">Regional network failures may make services in other </w:t>
-            </w:r>
-            <w:r>
-              <w:lastRenderedPageBreak/>
-              <w:t>countries temporarily unavailable.</w:t>
+              <w:t>Regional network failures may make services in other countries temporarily unavailable.</w:t>
             </w:r>
           </w:p>
         </w:tc>
@@ -22786,11 +22814,7 @@
               <w:t>Services</w:t>
             </w:r>
             <w:r>
-              <w:t xml:space="preserve"> is developed using Infrastructure as </w:t>
-            </w:r>
-            <w:r>
-              <w:lastRenderedPageBreak/>
-              <w:t>Code so can create a new environment in a new location, if directed to.</w:t>
+              <w:t xml:space="preserve"> is developed using Infrastructure as Code so can create a new environment in a new location, if directed to.</w:t>
             </w:r>
           </w:p>
         </w:tc>
@@ -23012,11 +23036,7 @@
               <w:t>MUST</w:t>
             </w:r>
             <w:r>
-              <w:t xml:space="preserve"> not be made unavailable for longer than the Maximum Tolerable Downtime (MTD) defined in </w:t>
-            </w:r>
-            <w:r>
-              <w:lastRenderedPageBreak/>
-              <w:t>the </w:t>
+              <w:t xml:space="preserve"> not be made unavailable for longer than the Maximum Tolerable Downtime (MTD) defined in the </w:t>
             </w:r>
             <w:r>
               <w:rPr>
@@ -23036,7 +23056,6 @@
           </w:tcPr>
           <w:p>
             <w:r>
-              <w:lastRenderedPageBreak/>
               <w:t>The system must not be made unavailable for use for longer than necessary.</w:t>
             </w:r>
           </w:p>
@@ -23060,11 +23079,7 @@
               <w:t xml:space="preserve">Automating delivery pipelines, using </w:t>
             </w:r>
             <w:r>
-              <w:t xml:space="preserve">Infrastructure as Code, Database </w:t>
-            </w:r>
-            <w:r>
-              <w:lastRenderedPageBreak/>
-              <w:t>schema as Code, Automated database backup restoration to permit – in the case of a Disaster – the recreation of a completely new environment within the delay stated within the </w:t>
+              <w:t>Infrastructure as Code, Database schema as Code, Automated database backup restoration to permit – in the case of a Disaster – the recreation of a completely new environment within the delay stated within the </w:t>
             </w:r>
             <w:r>
               <w:rPr>
@@ -23318,11 +23333,7 @@
           <w:p/>
           <w:p>
             <w:r>
-              <w:t xml:space="preserve">The system must be capable of running economically when </w:t>
-            </w:r>
-            <w:r>
-              <w:lastRenderedPageBreak/>
-              <w:t>not in demand, while not compromising its ability to meet projected peak demand.</w:t>
+              <w:t>The system must be capable of running economically when not in demand, while not compromising its ability to meet projected peak demand.</w:t>
             </w:r>
           </w:p>
         </w:tc>
@@ -23349,11 +23360,7 @@
               <w:t>Services</w:t>
             </w:r>
             <w:r>
-              <w:t xml:space="preserve"> dynamically scales back down based </w:t>
-            </w:r>
-            <w:r>
-              <w:lastRenderedPageBreak/>
-              <w:t>on the CPU consumption falling lower than a specified % for longer than a specified duration.</w:t>
+              <w:t xml:space="preserve"> dynamically scales back down based on the CPU consumption falling lower than a specified % for longer than a specified duration.</w:t>
             </w:r>
           </w:p>
         </w:tc>
@@ -23885,7 +23892,6 @@
         <w:rPr>
           <w:rFonts w:eastAsiaTheme="minorHAnsi"/>
         </w:rPr>
-        <w:lastRenderedPageBreak/>
         <w:t>Security</w:t>
       </w:r>
       <w:bookmarkEnd w:id="59"/>
@@ -24397,9 +24403,6 @@
             </w:r>
             <w:r>
               <w:br/>
-            </w:r>
-            <w:r>
-              <w:lastRenderedPageBreak/>
               <w:t xml:space="preserve">- </w:t>
             </w:r>
             <w:r>
@@ -24635,11 +24638,7 @@
           </w:p>
           <w:p>
             <w:r>
-              <w:t xml:space="preserve">Dynamically horizontally scalable infrastructure to </w:t>
-            </w:r>
-            <w:r>
-              <w:lastRenderedPageBreak/>
-              <w:t>handle sustained peek requests,</w:t>
+              <w:t>Dynamically horizontally scalable infrastructure to handle sustained peek requests,</w:t>
             </w:r>
           </w:p>
           <w:p>
@@ -24700,7 +24699,15 @@
             </w:r>
             <w:proofErr w:type="gramEnd"/>
             <w:r>
-              <w:t xml:space="preserve"> services are persisted in specialised </w:t>
+              <w:t xml:space="preserve"> services </w:t>
+            </w:r>
+            <w:proofErr w:type="gramStart"/>
+            <w:r>
+              <w:t>are persisted</w:t>
+            </w:r>
+            <w:proofErr w:type="gramEnd"/>
+            <w:r>
+              <w:t xml:space="preserve"> in specialised </w:t>
             </w:r>
             <w:r>
               <w:t xml:space="preserve">encrypted </w:t>
@@ -25138,14 +25145,7 @@
               <w:rPr>
                 <w:lang w:eastAsia="en-NZ"/>
               </w:rPr>
-              <w:t xml:space="preserve">This applies to non-prod environment devices and data as non-prod data environments are meant to test and demonstrate the controls applicable </w:t>
-            </w:r>
-            <w:r>
-              <w:rPr>
-                <w:lang w:eastAsia="en-NZ"/>
-              </w:rPr>
-              <w:lastRenderedPageBreak/>
-              <w:t xml:space="preserve">in a production data environment. </w:t>
+              <w:t xml:space="preserve">This applies to non-prod environment devices and data as non-prod data environments are meant to test and demonstrate the controls applicable in a production data environment. </w:t>
             </w:r>
             <w:r>
               <w:rPr>
@@ -25229,14 +25229,7 @@
                 <w:lang w:eastAsia="en-NZ"/>
               </w:rPr>
               <w:br/>
-              <w:t xml:space="preserve">The Functionality required for these stakeholders to perform their jobs without breaching this requirement must be provided for by the solution (i.e. diagnostics tracing, and error recording, both </w:t>
-            </w:r>
-            <w:r>
-              <w:rPr>
-                <w:lang w:eastAsia="en-NZ"/>
-              </w:rPr>
-              <w:lastRenderedPageBreak/>
-              <w:t>accessible by filtered searching, etc).</w:t>
+              <w:t>The Functionality required for these stakeholders to perform their jobs without breaching this requirement must be provided for by the solution (i.e. diagnostics tracing, and error recording, both accessible by filtered searching, etc).</w:t>
             </w:r>
           </w:p>
         </w:tc>
@@ -25453,45 +25446,31 @@
           </w:tcPr>
           <w:p>
             <w:r>
-              <w:t xml:space="preserve">Unsecured communication to </w:t>
-            </w:r>
-            <w:r>
-              <w:lastRenderedPageBreak/>
-              <w:t>services MUST not be accepted, redirecting to secure equivalents.</w:t>
-            </w:r>
-          </w:p>
-        </w:tc>
-        <w:tc>
-          <w:tcPr>
-            <w:tcW w:w="1985" w:type="dxa"/>
-          </w:tcPr>
-          <w:p>
-            <w:r>
-              <w:lastRenderedPageBreak/>
-              <w:t xml:space="preserve">Users type addresses into </w:t>
-            </w:r>
-            <w:r>
-              <w:lastRenderedPageBreak/>
-              <w:t>browsers without prepending with HTTPS, defaulting to HTTP.</w:t>
-            </w:r>
-          </w:p>
-        </w:tc>
-        <w:tc>
-          <w:tcPr>
-            <w:tcW w:w="1984" w:type="dxa"/>
-          </w:tcPr>
-          <w:p>
-            <w:r>
-              <w:lastRenderedPageBreak/>
+              <w:t>Unsecured communication to services MUST not be accepted, redirecting to secure equivalents.</w:t>
+            </w:r>
+          </w:p>
+        </w:tc>
+        <w:tc>
+          <w:tcPr>
+            <w:tcW w:w="1985" w:type="dxa"/>
+          </w:tcPr>
+          <w:p>
+            <w:r>
+              <w:t>Users type addresses into browsers without prepending with HTTPS, defaulting to HTTP.</w:t>
+            </w:r>
+          </w:p>
+        </w:tc>
+        <w:tc>
+          <w:tcPr>
+            <w:tcW w:w="1984" w:type="dxa"/>
+          </w:tcPr>
+          <w:p>
+            <w:r>
               <w:t>Sighting:</w:t>
             </w:r>
             <w:r>
               <w:br/>
-              <w:t xml:space="preserve">Invocations to </w:t>
-            </w:r>
-            <w:r>
-              <w:lastRenderedPageBreak/>
-              <w:t xml:space="preserve">service endpoints using insecure HTTP are not accepted. </w:t>
+              <w:t xml:space="preserve">Invocations to service endpoints using insecure HTTP are not accepted. </w:t>
             </w:r>
             <w:r>
               <w:br/>
@@ -25505,12 +25484,7 @@
           </w:tcPr>
           <w:p>
             <w:r>
-              <w:lastRenderedPageBreak/>
-              <w:t xml:space="preserve">Redirection is a configuration done </w:t>
-            </w:r>
-            <w:r>
-              <w:lastRenderedPageBreak/>
-              <w:t>at the server level, not the application installed within it.</w:t>
+              <w:t>Redirection is a configuration done at the server level, not the application installed within it.</w:t>
             </w:r>
           </w:p>
         </w:tc>
@@ -26831,7 +26805,6 @@
           </w:p>
           <w:p>
             <w:r>
-              <w:lastRenderedPageBreak/>
               <w:t xml:space="preserve">Note: </w:t>
             </w:r>
             <w:r>
@@ -26962,18 +26935,26 @@
           </w:tcPr>
           <w:p>
             <w:r>
-              <w:t xml:space="preserve">The less secrets maintained in a </w:t>
+              <w:t xml:space="preserve">The less secrets </w:t>
             </w:r>
             <w:proofErr w:type="gramStart"/>
             <w:r>
-              <w:t>solution,</w:t>
+              <w:t>maintained</w:t>
             </w:r>
             <w:proofErr w:type="gramEnd"/>
             <w:r>
-              <w:t xml:space="preserve"> the less attack surface </w:t>
-            </w:r>
-            <w:r>
-              <w:t>the system has to defend</w:t>
+              <w:t xml:space="preserve"> in a solution, the less attack surface </w:t>
+            </w:r>
+            <w:r>
+              <w:t xml:space="preserve">the system </w:t>
+            </w:r>
+            <w:proofErr w:type="gramStart"/>
+            <w:r>
+              <w:t>has to</w:t>
+            </w:r>
+            <w:proofErr w:type="gramEnd"/>
+            <w:r>
+              <w:t xml:space="preserve"> defend</w:t>
             </w:r>
             <w:r>
               <w:t>.</w:t>
@@ -27077,11 +27058,7 @@
               <w:br/>
             </w:r>
             <w:r>
-              <w:t xml:space="preserve">External PII </w:t>
-            </w:r>
-            <w:r>
-              <w:lastRenderedPageBreak/>
-              <w:t>Management Services</w:t>
+              <w:t>External PII Management Services</w:t>
             </w:r>
           </w:p>
         </w:tc>
@@ -27093,7 +27070,6 @@
           </w:tcPr>
           <w:p>
             <w:r>
-              <w:lastRenderedPageBreak/>
               <w:t>Services</w:t>
             </w:r>
             <w:r>
@@ -27106,11 +27082,7 @@
               <w:t>SHOULD</w:t>
             </w:r>
             <w:r>
-              <w:t xml:space="preserve"> persist Personally Identifiable Information (PII) in an external specialised and </w:t>
-            </w:r>
-            <w:r>
-              <w:lastRenderedPageBreak/>
-              <w:t>hardened storage service.</w:t>
+              <w:t xml:space="preserve"> persist Personally Identifiable Information (PII) in an external specialised and hardened storage service.</w:t>
             </w:r>
           </w:p>
         </w:tc>
@@ -27122,12 +27094,7 @@
           </w:tcPr>
           <w:p>
             <w:r>
-              <w:lastRenderedPageBreak/>
-              <w:t xml:space="preserve">The less PII information maintained in a solution, the less </w:t>
-            </w:r>
-            <w:r>
-              <w:lastRenderedPageBreak/>
-              <w:t>attack surfaces a solution has.</w:t>
+              <w:t>The less PII information maintained in a solution, the less attack surfaces a solution has.</w:t>
             </w:r>
           </w:p>
         </w:tc>
@@ -27153,11 +27120,7 @@
           </w:p>
           <w:p>
             <w:r>
-              <w:t xml:space="preserve">PII data cloned to the system's user </w:t>
-            </w:r>
-            <w:r>
-              <w:lastRenderedPageBreak/>
-              <w:t>profile is limited in scope.</w:t>
+              <w:t>PII data cloned to the system's user profile is limited in scope.</w:t>
             </w:r>
           </w:p>
           <w:p>
@@ -27370,7 +27333,6 @@
               <w:br/>
             </w:r>
             <w:r>
-              <w:lastRenderedPageBreak/>
               <w:t>Clear Text Credentials</w:t>
             </w:r>
           </w:p>
@@ -27383,7 +27345,6 @@
           </w:tcPr>
           <w:p>
             <w:r>
-              <w:lastRenderedPageBreak/>
               <w:t>Services</w:t>
             </w:r>
             <w:r>
@@ -27417,11 +27378,7 @@
               <w:t>SHOULD</w:t>
             </w:r>
             <w:r>
-              <w:t xml:space="preserve"> not be </w:t>
-            </w:r>
-            <w:r>
-              <w:lastRenderedPageBreak/>
-              <w:t>transmitted in clear text.</w:t>
+              <w:t xml:space="preserve"> not be transmitted in clear text.</w:t>
             </w:r>
           </w:p>
         </w:tc>
@@ -27439,11 +27396,7 @@
           </w:tcPr>
           <w:p>
             <w:r>
-              <w:t xml:space="preserve">Where technically feasible, the solution is integrated with external services without transmitting </w:t>
-            </w:r>
-            <w:r>
-              <w:lastRenderedPageBreak/>
-              <w:t>clear text credentials.</w:t>
+              <w:t>Where technically feasible, the solution is integrated with external services without transmitting clear text credentials.</w:t>
             </w:r>
           </w:p>
         </w:tc>
@@ -28018,11 +27971,7 @@
           </w:p>
           <w:p>
             <w:r>
-              <w:t xml:space="preserve">Project members with write access to code repositories must be trained as to the importance of not committing credentials and reporting when </w:t>
-            </w:r>
-            <w:r>
-              <w:lastRenderedPageBreak/>
-              <w:t>such an error has happened.</w:t>
+              <w:t>Project members with write access to code repositories must be trained as to the importance of not committing credentials and reporting when such an error has happened.</w:t>
             </w:r>
           </w:p>
         </w:tc>
@@ -28278,15 +28227,7 @@
           </w:tcPr>
           <w:p>
             <w:r>
-              <w:t xml:space="preserve">The shorter the duration certificates are </w:t>
-            </w:r>
-            <w:proofErr w:type="gramStart"/>
-            <w:r>
-              <w:t>used,</w:t>
-            </w:r>
-            <w:proofErr w:type="gramEnd"/>
-            <w:r>
-              <w:t xml:space="preserve"> the less time bad actors have to crack the certificates.</w:t>
+              <w:t>The shorter the duration certificates are used, the less time bad actors have to crack the certificates.</w:t>
             </w:r>
           </w:p>
         </w:tc>
@@ -28315,11 +28256,7 @@
               <w:t>Services</w:t>
             </w:r>
             <w:r>
-              <w:t xml:space="preserve"> ensures that deployments </w:t>
-            </w:r>
-            <w:r>
-              <w:lastRenderedPageBreak/>
-              <w:t>are done frequently (approximately every fortnight), regardless of new features having been developed or not, to ensure certs are rotated often (no more than 90 days).</w:t>
+              <w:t xml:space="preserve"> ensures that deployments are done frequently (approximately every fortnight), regardless of new features having been developed or not, to ensure certs are rotated often (no more than 90 days).</w:t>
             </w:r>
           </w:p>
         </w:tc>
@@ -29208,11 +29145,7 @@
               <w:t xml:space="preserve"> later</w:t>
             </w:r>
             <w:r>
-              <w:t xml:space="preserve"> correctly ascertain the </w:t>
-            </w:r>
-            <w:r>
-              <w:lastRenderedPageBreak/>
-              <w:t xml:space="preserve">process by which </w:t>
+              <w:t xml:space="preserve"> correctly ascertain the process by which </w:t>
             </w:r>
             <w:r>
               <w:t xml:space="preserve">system or user data </w:t>
@@ -29229,12 +29162,7 @@
           </w:tcPr>
           <w:p>
             <w:r>
-              <w:lastRenderedPageBreak/>
-              <w:t xml:space="preserve">Discovery of irregular activity may be months or years after the event, or happen sporadically over a </w:t>
-            </w:r>
-            <w:r>
-              <w:lastRenderedPageBreak/>
-              <w:t>long duration, so records should be kept for the duration of the solution.</w:t>
+              <w:t>Discovery of irregular activity may be months or years after the event, or happen sporadically over a long duration, so records should be kept for the duration of the solution.</w:t>
             </w:r>
           </w:p>
           <w:p>
@@ -29260,7 +29188,6 @@
           </w:tcPr>
           <w:p>
             <w:r>
-              <w:lastRenderedPageBreak/>
               <w:t>Sighting:</w:t>
             </w:r>
             <w:r>
@@ -29278,7 +29205,6 @@
           </w:p>
           <w:p>
             <w:r>
-              <w:lastRenderedPageBreak/>
               <w:t>Affirmation:</w:t>
             </w:r>
             <w:r>
@@ -29293,7 +29219,6 @@
           </w:tcPr>
           <w:p>
             <w:r>
-              <w:lastRenderedPageBreak/>
               <w:t>Services</w:t>
             </w:r>
             <w:r>
@@ -29305,11 +29230,15 @@
             </w:r>
             <w:proofErr w:type="gramEnd"/>
             <w:r>
-              <w:t xml:space="preserve"> keep the </w:t>
-            </w:r>
-            <w:r>
-              <w:lastRenderedPageBreak/>
-              <w:t>solution performant, and whether the solution’s audit records are queryable when required.</w:t>
+              <w:t xml:space="preserve"> keep the solution performant, and whether the solution’s audit records are queryable when </w:t>
+            </w:r>
+            <w:proofErr w:type="gramStart"/>
+            <w:r>
+              <w:t>required</w:t>
+            </w:r>
+            <w:proofErr w:type="gramEnd"/>
+            <w:r>
+              <w:t>.</w:t>
             </w:r>
           </w:p>
         </w:tc>
@@ -29330,11 +29259,7 @@
           </w:p>
           <w:p>
             <w:r>
-              <w:t xml:space="preserve">Does it record or reference the User </w:t>
-            </w:r>
-            <w:r>
-              <w:lastRenderedPageBreak/>
-              <w:t xml:space="preserve">who made the </w:t>
+              <w:t xml:space="preserve">Does it record or reference the User who made the </w:t>
             </w:r>
             <w:proofErr w:type="gramStart"/>
             <w:r>
@@ -29463,11 +29388,7 @@
           </w:p>
           <w:p>
             <w:r>
-              <w:t xml:space="preserve">A user may be using two different </w:t>
-            </w:r>
-            <w:r>
-              <w:lastRenderedPageBreak/>
-              <w:t>browser types on the same system.</w:t>
+              <w:t>A user may be using two different browser types on the same system.</w:t>
             </w:r>
           </w:p>
           <w:p>
@@ -29482,7 +29403,6 @@
           </w:tcPr>
           <w:p>
             <w:r>
-              <w:lastRenderedPageBreak/>
               <w:t>Sighted:</w:t>
             </w:r>
             <w:r>
@@ -29500,11 +29420,7 @@
             </w:r>
             <w:proofErr w:type="gramEnd"/>
             <w:r>
-              <w:t xml:space="preserve"> two </w:t>
-            </w:r>
-            <w:r>
-              <w:lastRenderedPageBreak/>
-              <w:t xml:space="preserve">concurrent Sessions associated to the same user, distinguishable by different </w:t>
+              <w:t xml:space="preserve"> two concurrent Sessions associated to the same user, distinguishable by different </w:t>
             </w:r>
             <w:proofErr w:type="spellStart"/>
             <w:r>
@@ -29522,12 +29438,7 @@
           </w:tcPr>
           <w:p>
             <w:r>
-              <w:lastRenderedPageBreak/>
-              <w:t xml:space="preserve">Diagnostics and Session Operation auditing records of Anonymous Users who have not yet signed in will appear to be the same user (Anonymous) with many different </w:t>
-            </w:r>
-            <w:r>
-              <w:lastRenderedPageBreak/>
-              <w:t>concurrent Sessions.</w:t>
+              <w:t>Diagnostics and Session Operation auditing records of Anonymous Users who have not yet signed in will appear to be the same user (Anonymous) with many different concurrent Sessions.</w:t>
             </w:r>
           </w:p>
           <w:p>
@@ -29566,7 +29477,6 @@
       </w:pPr>
       <w:bookmarkStart w:id="67" w:name="_Toc156204954"/>
       <w:r>
-        <w:lastRenderedPageBreak/>
         <w:t>Accountability</w:t>
       </w:r>
       <w:bookmarkEnd w:id="67"/>
@@ -29616,8 +29526,13 @@
       </w:r>
     </w:p>
     <w:p>
-      <w:r>
-        <w:t xml:space="preserve">In essence, it’s the subject of </w:t>
+      <w:proofErr w:type="gramStart"/>
+      <w:r>
+        <w:t>In essence, it’s</w:t>
+      </w:r>
+      <w:proofErr w:type="gramEnd"/>
+      <w:r>
+        <w:t xml:space="preserve"> the subject of </w:t>
       </w:r>
       <w:r>
         <w:t xml:space="preserve">tying Auditing to </w:t>
@@ -29640,7 +29555,15 @@
       </w:r>
       <w:proofErr w:type="gramEnd"/>
       <w:r>
-        <w:t xml:space="preserve"> that a system User is a correctly identified external user (see </w:t>
+        <w:t xml:space="preserve"> that a system User is a correctly </w:t>
+      </w:r>
+      <w:proofErr w:type="gramStart"/>
+      <w:r>
+        <w:t>identified</w:t>
+      </w:r>
+      <w:proofErr w:type="gramEnd"/>
+      <w:r>
+        <w:t xml:space="preserve"> external user (see </w:t>
       </w:r>
       <w:r>
         <w:rPr>
@@ -29903,11 +29826,7 @@
           </w:p>
           <w:p>
             <w:r>
-              <w:t xml:space="preserve">This might include but are not limited to resource workflow Status changes, commenting, </w:t>
-            </w:r>
-            <w:r>
-              <w:lastRenderedPageBreak/>
-              <w:t>approvals, etc.</w:t>
+              <w:t>This might include but are not limited to resource workflow Status changes, commenting, approvals, etc.</w:t>
             </w:r>
             <w:r>
               <w:br/>
@@ -29939,11 +29858,7 @@
           </w:p>
           <w:p>
             <w:r>
-              <w:t xml:space="preserve">Does it show different kinds of </w:t>
-            </w:r>
-            <w:r>
-              <w:lastRenderedPageBreak/>
-              <w:t>Operations, not just CRUD?</w:t>
+              <w:t>Does it show different kinds of Operations, not just CRUD?</w:t>
             </w:r>
           </w:p>
           <w:p>
@@ -30155,7 +30070,6 @@
         <w:pStyle w:val="BodyText"/>
       </w:pPr>
       <w:r>
-        <w:lastRenderedPageBreak/>
         <w:t xml:space="preserve">In </w:t>
       </w:r>
       <w:r>
@@ -30591,11 +30505,15 @@
             </w:r>
             <w:proofErr w:type="gramEnd"/>
             <w:r>
-              <w:t xml:space="preserve"> required -- for example, public consumer IdPs often have Terms and conditions specifying a minimum age, making them unsuitable for young learners – but this must be </w:t>
-            </w:r>
-            <w:r>
-              <w:lastRenderedPageBreak/>
-              <w:t xml:space="preserve">mutually accepted as being the only reasonable course of action. </w:t>
+              <w:t xml:space="preserve"> </w:t>
+            </w:r>
+            <w:proofErr w:type="gramStart"/>
+            <w:r>
+              <w:t>required</w:t>
+            </w:r>
+            <w:proofErr w:type="gramEnd"/>
+            <w:r>
+              <w:t xml:space="preserve"> -- for example, public consumer IdPs often have Terms and conditions specifying a minimum age, making them unsuitable for young learners – but this must be mutually accepted as being the only reasonable course of action. </w:t>
             </w:r>
           </w:p>
         </w:tc>
@@ -31056,19 +30974,12 @@
               <w:rPr>
                 <w:rStyle w:val="BodyTextTermChar"/>
               </w:rPr>
-              <w:t xml:space="preserve">Organisation </w:t>
+              <w:t>Organisation Managed</w:t>
             </w:r>
             <w:r>
               <w:rPr>
                 <w:rStyle w:val="BodyTextTermChar"/>
               </w:rPr>
-              <w:lastRenderedPageBreak/>
-              <w:t>Managed</w:t>
-            </w:r>
-            <w:r>
-              <w:rPr>
-                <w:rStyle w:val="BodyTextTermChar"/>
-              </w:rPr>
               <w:t>’</w:t>
             </w:r>
             <w:r>
@@ -31082,7 +30993,6 @@
           </w:tcPr>
           <w:p>
             <w:r>
-              <w:lastRenderedPageBreak/>
               <w:t xml:space="preserve">Vendor support </w:t>
             </w:r>
             <w:r>
@@ -31095,11 +31005,7 @@
               <w:t xml:space="preserve">-in </w:t>
             </w:r>
             <w:r>
-              <w:t xml:space="preserve">is </w:t>
-            </w:r>
-            <w:r>
-              <w:lastRenderedPageBreak/>
-              <w:t xml:space="preserve">not </w:t>
+              <w:t xml:space="preserve">is not </w:t>
             </w:r>
             <w:r>
               <w:t>desired as the only option</w:t>
@@ -31124,11 +31030,7 @@
               <w:t>Services</w:t>
             </w:r>
             <w:r>
-              <w:t xml:space="preserve"> uses an ALM managed repository for configuration, scripts, etc. </w:t>
-            </w:r>
-            <w:r>
-              <w:lastRenderedPageBreak/>
-              <w:t>required to configure a new environment and deploy the solution’s code to it.</w:t>
+              <w:t xml:space="preserve"> uses an ALM managed repository for configuration, scripts, etc. required to configure a new environment and deploy the solution’s code to it.</w:t>
             </w:r>
           </w:p>
         </w:tc>
@@ -31485,7 +31387,6 @@
     </w:p>
     <w:p>
       <w:r>
-        <w:lastRenderedPageBreak/>
         <w:t>Requirements: None</w:t>
       </w:r>
       <w:r>
@@ -31963,7 +31864,6 @@
               <w:t xml:space="preserve">on a per-user basis </w:t>
             </w:r>
             <w:r>
-              <w:lastRenderedPageBreak/>
               <w:t>(i.e., not remain a permanent distracting banner message).</w:t>
             </w:r>
           </w:p>
@@ -31992,7 +31892,6 @@
           </w:tcPr>
           <w:p>
             <w:r>
-              <w:lastRenderedPageBreak/>
               <w:t>Note:</w:t>
             </w:r>
             <w:r>
@@ -32168,7 +32067,6 @@
           </w:p>
           <w:p>
             <w:r>
-              <w:lastRenderedPageBreak/>
               <w:t>The sighted service page states When service is expected to be returned.</w:t>
             </w:r>
           </w:p>
@@ -32179,7 +32077,6 @@
           </w:tcPr>
           <w:p>
             <w:r>
-              <w:lastRenderedPageBreak/>
               <w:br/>
             </w:r>
           </w:p>
@@ -33174,11 +33071,7 @@
             </w:r>
             <w:proofErr w:type="spellEnd"/>
             <w:r>
-              <w:t xml:space="preserve"> account within a </w:t>
-            </w:r>
-            <w:r>
-              <w:lastRenderedPageBreak/>
-              <w:t xml:space="preserve">sub domain under the service’s domain name. </w:t>
+              <w:t xml:space="preserve"> account within a sub domain under the service’s domain name. </w:t>
             </w:r>
             <w:r>
               <w:br/>
@@ -33474,21 +33367,16 @@
           </w:p>
           <w:p>
             <w:r>
-              <w:t xml:space="preserve">The environments must be discoverable using predicable DNS names, following </w:t>
-            </w:r>
-            <w:r>
-              <w:lastRenderedPageBreak/>
-              <w:t>organisation naming patterns.</w:t>
-            </w:r>
-          </w:p>
-        </w:tc>
-        <w:tc>
-          <w:tcPr>
-            <w:tcW w:w="1985" w:type="dxa"/>
-          </w:tcPr>
-          <w:p>
-            <w:r>
-              <w:lastRenderedPageBreak/>
+              <w:t>The environments must be discoverable using predicable DNS names, following organisation naming patterns.</w:t>
+            </w:r>
+          </w:p>
+        </w:tc>
+        <w:tc>
+          <w:tcPr>
+            <w:tcW w:w="1985" w:type="dxa"/>
+          </w:tcPr>
+          <w:p>
+            <w:r>
               <w:t>The use of Production Data in a non-disclosed manner is illegal, putting the organisation at risk of both reputational and financial damage.</w:t>
             </w:r>
           </w:p>
@@ -33662,7 +33550,15 @@
           </w:p>
           <w:p>
             <w:r>
-              <w:t xml:space="preserve">A recommended approach is to develop Personas to represent </w:t>
+              <w:t xml:space="preserve">A recommended approach is to develop Personas to </w:t>
+            </w:r>
+            <w:proofErr w:type="gramStart"/>
+            <w:r>
+              <w:t>represent</w:t>
+            </w:r>
+            <w:proofErr w:type="gramEnd"/>
+            <w:r>
+              <w:t xml:space="preserve"> </w:t>
             </w:r>
             <w:proofErr w:type="gramStart"/>
             <w:r>
@@ -34191,14 +34087,7 @@
               <w:rPr>
                 <w:rStyle w:val="BodyTextTermChar"/>
               </w:rPr>
-              <w:t xml:space="preserve">Organisation </w:t>
-            </w:r>
-            <w:r>
-              <w:rPr>
-                <w:rStyle w:val="BodyTextTermChar"/>
-              </w:rPr>
-              <w:lastRenderedPageBreak/>
-              <w:t>Managed</w:t>
+              <w:t>Organisation Managed</w:t>
             </w:r>
             <w:r>
               <w:t>’ digital repository.</w:t>
@@ -34517,11 +34406,7 @@
           </w:p>
           <w:p>
             <w:r>
-              <w:t xml:space="preserve">Signage of the audit log entries is </w:t>
-            </w:r>
-            <w:r>
-              <w:lastRenderedPageBreak/>
-              <w:t>not implemented in this system.</w:t>
+              <w:t>Signage of the audit log entries is not implemented in this system.</w:t>
             </w:r>
           </w:p>
         </w:tc>
@@ -34760,11 +34645,7 @@
               <w:t>ed</w:t>
             </w:r>
             <w:r>
-              <w:t xml:space="preserve"> </w:t>
-            </w:r>
-            <w:r>
-              <w:lastRenderedPageBreak/>
-              <w:t>paged diagnostics, error and audit records. </w:t>
+              <w:t xml:space="preserve"> paged diagnostics, error and audit records. </w:t>
             </w:r>
           </w:p>
         </w:tc>
@@ -34775,7 +34656,6 @@
           </w:tcPr>
           <w:p>
             <w:r>
-              <w:lastRenderedPageBreak/>
               <w:t> Support specialists must have the tools to find records to diagnose user and system activity.</w:t>
             </w:r>
           </w:p>
@@ -34795,11 +34675,7 @@
               <w:t>Services</w:t>
             </w:r>
             <w:r>
-              <w:t xml:space="preserve"> makes system records searchable in an efficient manner, using filtering </w:t>
-            </w:r>
-            <w:r>
-              <w:lastRenderedPageBreak/>
-              <w:t>criteria &amp; response paging.</w:t>
+              <w:t xml:space="preserve"> makes system records searchable in an efficient manner, using filtering criteria &amp; response paging.</w:t>
             </w:r>
           </w:p>
         </w:tc>
@@ -34900,7 +34776,15 @@
           </w:tcPr>
           <w:p>
             <w:r>
-              <w:t xml:space="preserve">Metrics are required to be collected </w:t>
+              <w:t xml:space="preserve">Metrics </w:t>
+            </w:r>
+            <w:proofErr w:type="gramStart"/>
+            <w:r>
+              <w:t>are required to</w:t>
+            </w:r>
+            <w:proofErr w:type="gramEnd"/>
+            <w:r>
+              <w:t xml:space="preserve"> be collected </w:t>
             </w:r>
             <w:proofErr w:type="gramStart"/>
             <w:r>
@@ -35075,11 +34959,7 @@
               <w:t>Services</w:t>
             </w:r>
             <w:r>
-              <w:t xml:space="preserve"> diagnostics messages are copied to a target </w:t>
-            </w:r>
-            <w:r>
-              <w:lastRenderedPageBreak/>
-              <w:t>area available to an organisation’s SIEM system to import.</w:t>
+              <w:t xml:space="preserve"> diagnostics messages are copied to a target area available to an organisation’s SIEM system to import.</w:t>
             </w:r>
           </w:p>
         </w:tc>
@@ -35245,7 +35125,6 @@
           </w:p>
           <w:p>
             <w:r>
-              <w:lastRenderedPageBreak/>
               <w:t>Resources collaborated on per User</w:t>
             </w:r>
           </w:p>
@@ -35395,11 +35274,7 @@
             </w:r>
             <w:proofErr w:type="gramEnd"/>
             <w:r>
-              <w:t xml:space="preserve"> is rapid enough to not delay </w:t>
-            </w:r>
-            <w:r>
-              <w:lastRenderedPageBreak/>
-              <w:t>deployments of environments, functionality and data is to automate all testing.</w:t>
+              <w:t xml:space="preserve"> is rapid enough to not delay deployments of environments, functionality and data is to automate all testing.</w:t>
             </w:r>
           </w:p>
         </w:tc>
@@ -35436,11 +35311,7 @@
           </w:p>
           <w:p>
             <w:r>
-              <w:t xml:space="preserve">API service facade authorisation, access and </w:t>
-            </w:r>
-            <w:r>
-              <w:lastRenderedPageBreak/>
-              <w:t>functionality integration testing</w:t>
+              <w:t>API service facade authorisation, access and functionality integration testing</w:t>
             </w:r>
           </w:p>
           <w:p>
@@ -35589,11 +35460,7 @@
           </w:p>
           <w:p>
             <w:r>
-              <w:t xml:space="preserve">use of available environment services (reusing enterprise systems, including IdPs, as </w:t>
-            </w:r>
-            <w:r>
-              <w:lastRenderedPageBreak/>
-              <w:t>malware validation, smtp services, etc.)</w:t>
+              <w:t>use of available environment services (reusing enterprise systems, including IdPs, as malware validation, smtp services, etc.)</w:t>
             </w:r>
           </w:p>
           <w:p>
@@ -35942,10 +35809,18 @@
               <w:t>SHOULD</w:t>
             </w:r>
             <w:r>
-              <w:t xml:space="preserve"> allow modification to one component or group of </w:t>
+              <w:t xml:space="preserve"> allow modification to one </w:t>
             </w:r>
             <w:proofErr w:type="gramStart"/>
             <w:r>
+              <w:t>component</w:t>
+            </w:r>
+            <w:proofErr w:type="gramEnd"/>
+            <w:r>
+              <w:t xml:space="preserve"> or group of </w:t>
+            </w:r>
+            <w:proofErr w:type="gramStart"/>
+            <w:r>
               <w:t>functionality</w:t>
             </w:r>
             <w:proofErr w:type="gramEnd"/>
@@ -35974,11 +35849,7 @@
           </w:p>
           <w:p>
             <w:r>
-              <w:t xml:space="preserve">Consider describing the use of external </w:t>
-            </w:r>
-            <w:r>
-              <w:lastRenderedPageBreak/>
-              <w:t>3rd party subscriptions services for Identity services, PII storage services, confidential storage services, structured and unstructured storage services, caching, malware detection, content validation, etc.</w:t>
+              <w:t>Consider describing the use of external 3rd party subscriptions services for Identity services, PII storage services, confidential storage services, structured and unstructured storage services, caching, malware detection, content validation, etc.</w:t>
             </w:r>
           </w:p>
           <w:p>
@@ -36186,11 +36057,7 @@
               <w:t xml:space="preserve"> be developed and maintained to current </w:t>
             </w:r>
             <w:r>
-              <w:t xml:space="preserve">&amp; </w:t>
-            </w:r>
-            <w:r>
-              <w:lastRenderedPageBreak/>
-              <w:t xml:space="preserve">maintained </w:t>
+              <w:t xml:space="preserve">&amp; maintained </w:t>
             </w:r>
             <w:r>
               <w:t>Web Standards.</w:t>
@@ -36204,7 +36071,6 @@
           </w:tcPr>
           <w:p>
             <w:r>
-              <w:lastRenderedPageBreak/>
               <w:t>Services</w:t>
             </w:r>
             <w:r>
@@ -36229,7 +36095,6 @@
           </w:p>
           <w:p>
             <w:r>
-              <w:lastRenderedPageBreak/>
               <w:t>HTML5+</w:t>
             </w:r>
           </w:p>
@@ -36445,7 +36310,6 @@
           </w:p>
           <w:p>
             <w:r>
-              <w:lastRenderedPageBreak/>
               <w:t>Users (# of users, # of new and leaving users, etc.)</w:t>
             </w:r>
           </w:p>
@@ -36496,7 +36360,6 @@
           </w:p>
           <w:p>
             <w:r>
-              <w:lastRenderedPageBreak/>
               <w:t>Operations Concerns:</w:t>
             </w:r>
           </w:p>
@@ -36567,7 +36430,6 @@
         <w:rPr>
           <w:rFonts w:eastAsiaTheme="minorHAnsi"/>
         </w:rPr>
-        <w:lastRenderedPageBreak/>
         <w:t>Portability</w:t>
       </w:r>
       <w:bookmarkEnd w:id="85"/>
@@ -36999,8 +36861,13 @@
             <w:tcW w:w="1985" w:type="dxa"/>
           </w:tcPr>
           <w:p>
-            <w:r>
-              <w:t>Is the system</w:t>
+            <w:proofErr w:type="gramStart"/>
+            <w:r>
+              <w:t>Is</w:t>
+            </w:r>
+            <w:proofErr w:type="gramEnd"/>
+            <w:r>
+              <w:t xml:space="preserve"> the system</w:t>
             </w:r>
             <w:r>
               <w:t>’s</w:t>
@@ -37739,7 +37606,6 @@
               <w:rPr>
                 <w:color w:val="FF0000"/>
               </w:rPr>
-              <w:lastRenderedPageBreak/>
               <w:t>Automated Data Restoration.</w:t>
             </w:r>
           </w:p>
@@ -37801,14 +37667,7 @@
               <w:rPr>
                 <w:color w:val="FF0000"/>
               </w:rPr>
-              <w:t xml:space="preserve">the solution uses an automated pipeline to recreate environments from scratch and </w:t>
-            </w:r>
-            <w:r>
-              <w:rPr>
-                <w:color w:val="FF0000"/>
-              </w:rPr>
-              <w:lastRenderedPageBreak/>
-              <w:t>deploys logic and data to them.</w:t>
+              <w:t>the solution uses an automated pipeline to recreate environments from scratch and deploys logic and data to them.</w:t>
             </w:r>
           </w:p>
           <w:p>
@@ -37913,11 +37772,7 @@
           </w:tcPr>
           <w:p>
             <w:r>
-              <w:t>QR-DEF-</w:t>
-            </w:r>
-            <w:r>
-              <w:lastRenderedPageBreak/>
-              <w:t>POR-</w:t>
+              <w:t>QR-DEF-POR-</w:t>
             </w:r>
             <w:r>
               <w:br/>
@@ -37933,7 +37788,6 @@
           </w:tcPr>
           <w:p>
             <w:r>
-              <w:lastRenderedPageBreak/>
               <w:t>Default/</w:t>
             </w:r>
             <w:r>
@@ -37951,7 +37805,6 @@
               <w:br/>
             </w:r>
             <w:r>
-              <w:lastRenderedPageBreak/>
               <w:t>Automated Integration Deployment</w:t>
             </w:r>
           </w:p>
@@ -37963,15 +37816,10 @@
           </w:tcPr>
           <w:p>
             <w:r>
-              <w:lastRenderedPageBreak/>
               <w:t>Services</w:t>
             </w:r>
             <w:r>
-              <w:t xml:space="preserve"> testing processes COULD include deploying </w:t>
-            </w:r>
-            <w:r>
-              <w:lastRenderedPageBreak/>
-              <w:t>agreed 3rd party API clients.</w:t>
+              <w:t xml:space="preserve"> testing processes COULD include deploying agreed 3rd party API clients.</w:t>
             </w:r>
           </w:p>
         </w:tc>
@@ -37983,36 +37831,35 @@
           <w:p>
             <w:proofErr w:type="gramStart"/>
             <w:r>
-              <w:lastRenderedPageBreak/>
               <w:t>In order to</w:t>
             </w:r>
             <w:proofErr w:type="gramEnd"/>
             <w:r>
-              <w:t xml:space="preserve"> verify that API changes do not break </w:t>
-            </w:r>
-            <w:r>
-              <w:lastRenderedPageBreak/>
-              <w:t>remote key Service Clients, consider validating the changes by connecting to the API as intended.</w:t>
-            </w:r>
-          </w:p>
-        </w:tc>
-        <w:tc>
-          <w:tcPr>
-            <w:tcW w:w="1984" w:type="dxa"/>
-          </w:tcPr>
-          <w:p/>
-        </w:tc>
-        <w:tc>
-          <w:tcPr>
-            <w:tcW w:w="1985" w:type="dxa"/>
-          </w:tcPr>
-          <w:p>
-            <w:r>
-              <w:t xml:space="preserve">NRN: Unit-testing and integration testing are </w:t>
-            </w:r>
-            <w:r>
-              <w:lastRenderedPageBreak/>
-              <w:t>performing the same functionality. This requirement is not required.</w:t>
+              <w:t xml:space="preserve"> verify that API changes do not break remote key Service Clients, consider </w:t>
+            </w:r>
+            <w:proofErr w:type="gramStart"/>
+            <w:r>
+              <w:t>validating</w:t>
+            </w:r>
+            <w:proofErr w:type="gramEnd"/>
+            <w:r>
+              <w:t xml:space="preserve"> the changes by connecting to the API as intended.</w:t>
+            </w:r>
+          </w:p>
+        </w:tc>
+        <w:tc>
+          <w:tcPr>
+            <w:tcW w:w="1984" w:type="dxa"/>
+          </w:tcPr>
+          <w:p/>
+        </w:tc>
+        <w:tc>
+          <w:tcPr>
+            <w:tcW w:w="1985" w:type="dxa"/>
+          </w:tcPr>
+          <w:p>
+            <w:r>
+              <w:t>NRN: Unit-testing and integration testing are performing the same functionality. This requirement is not required.</w:t>
             </w:r>
           </w:p>
           <w:p/>
@@ -38675,7 +38522,15 @@
           </w:tcPr>
           <w:p>
             <w:r>
-              <w:t xml:space="preserve">Note: being able to integrate using current approaches does not preclude the integration </w:t>
+              <w:t xml:space="preserve">Note: being able to integrate using current approaches does not </w:t>
+            </w:r>
+            <w:proofErr w:type="gramStart"/>
+            <w:r>
+              <w:t>preclude</w:t>
+            </w:r>
+            <w:proofErr w:type="gramEnd"/>
+            <w:r>
+              <w:t xml:space="preserve"> the integration </w:t>
             </w:r>
             <w:proofErr w:type="gramStart"/>
             <w:r>
@@ -38853,21 +38708,16 @@
           </w:p>
           <w:p>
             <w:r>
-              <w:t xml:space="preserve">Avoid replacing like-for-like by </w:t>
-            </w:r>
-            <w:r>
-              <w:lastRenderedPageBreak/>
-              <w:t>focusing too much on the same functions, rather than outcomes.</w:t>
-            </w:r>
-          </w:p>
-        </w:tc>
-        <w:tc>
-          <w:tcPr>
-            <w:tcW w:w="1984" w:type="dxa"/>
-          </w:tcPr>
-          <w:p>
-            <w:r>
-              <w:lastRenderedPageBreak/>
+              <w:t>Avoid replacing like-for-like by focusing too much on the same functions, rather than outcomes.</w:t>
+            </w:r>
+          </w:p>
+        </w:tc>
+        <w:tc>
+          <w:tcPr>
+            <w:tcW w:w="1984" w:type="dxa"/>
+          </w:tcPr>
+          <w:p>
+            <w:r>
               <w:t xml:space="preserve">Compare the </w:t>
             </w:r>
             <w:r>
@@ -39303,7 +39153,6 @@
           </w:p>
           <w:p>
             <w:r>
-              <w:lastRenderedPageBreak/>
               <w:t>Is there an Accessibility report showing existing compliance?</w:t>
             </w:r>
           </w:p>
@@ -39314,7 +39163,6 @@
           </w:tcPr>
           <w:p>
             <w:r>
-              <w:lastRenderedPageBreak/>
               <w:t xml:space="preserve">Regulations exist to ensure Users </w:t>
             </w:r>
             <w:r>
@@ -39343,11 +39191,7 @@
             </w:r>
             <w:r>
               <w:br/>
-              <w:t xml:space="preserve">- how to or who to contact to correct </w:t>
-            </w:r>
-            <w:r>
-              <w:lastRenderedPageBreak/>
-              <w:t>personal information</w:t>
+              <w:t>- how to or who to contact to correct personal information</w:t>
             </w:r>
             <w:r>
               <w:br/>
@@ -39386,11 +39230,7 @@
           </w:p>
           <w:p>
             <w:r>
-              <w:t xml:space="preserve">Does the system disclose data collected, purpose, who it is shared with, how long it is made available before being </w:t>
-            </w:r>
-            <w:r>
-              <w:lastRenderedPageBreak/>
-              <w:t>removed from access?</w:t>
+              <w:t>Does the system disclose data collected, purpose, who it is shared with, how long it is made available before being removed from access?</w:t>
             </w:r>
           </w:p>
           <w:p>
@@ -39683,11 +39523,7 @@
               <w:t xml:space="preserve"> </w:t>
             </w:r>
             <w:r>
-              <w:t xml:space="preserve">functional purposes on this site only, no </w:t>
-            </w:r>
-            <w:r>
-              <w:lastRenderedPageBreak/>
-              <w:t>confirmation is required by end users.</w:t>
+              <w:t>functional purposes on this site only, no confirmation is required by end users.</w:t>
             </w:r>
           </w:p>
         </w:tc>
@@ -39999,7 +39835,6 @@
           </w:p>
           <w:p>
             <w:r>
-              <w:lastRenderedPageBreak/>
               <w:t>Alternatively, it implies providing a contact point (e.g., an email address) for requesting changes.</w:t>
             </w:r>
           </w:p>
@@ -40035,11 +39870,7 @@
           </w:p>
           <w:p>
             <w:r>
-              <w:t xml:space="preserve">Can the system provide a means to </w:t>
-            </w:r>
-            <w:r>
-              <w:lastRenderedPageBreak/>
-              <w:t>review and reject or accept changes?</w:t>
+              <w:t>Can the system provide a means to review and reject or accept changes?</w:t>
             </w:r>
           </w:p>
           <w:p>
@@ -40368,7 +40199,6 @@
       <w:bookmarkStart w:id="100" w:name="_Toc145049430"/>
       <w:bookmarkStart w:id="101" w:name="_Toc156204971"/>
       <w:r>
-        <w:lastRenderedPageBreak/>
         <w:t>Appendices</w:t>
       </w:r>
       <w:bookmarkEnd w:id="100"/>
@@ -40522,33 +40352,17 @@
       <w:bookmarkEnd w:id="105"/>
     </w:p>
     <w:p>
-      <w:r>
-        <w:fldChar w:fldCharType="begin"/>
-      </w:r>
-      <w:r>
-        <w:instrText xml:space="preserve"> TOC \h \z \c "Table" </w:instrText>
-      </w:r>
-      <w:r>
-        <w:fldChar w:fldCharType="separate"/>
-      </w:r>
-      <w:r>
-        <w:rPr>
-          <w:b/>
-          <w:bCs/>
-          <w:noProof/>
-          <w:lang w:val="en-US"/>
-        </w:rPr>
-        <w:t>No table of figures entries found.</w:t>
-      </w:r>
-      <w:r>
-        <w:rPr>
-          <w:b/>
-          <w:bCs/>
-          <w:noProof/>
-          <w:lang w:val="en-US"/>
-        </w:rPr>
-        <w:fldChar w:fldCharType="end"/>
-      </w:r>
+      <w:fldSimple w:instr=" TOC \h \z \c &quot;Table&quot; ">
+        <w:r>
+          <w:rPr>
+            <w:b/>
+            <w:bCs/>
+            <w:noProof/>
+            <w:lang w:val="en-US"/>
+          </w:rPr>
+          <w:t>No table of figures entries found.</w:t>
+        </w:r>
+      </w:fldSimple>
     </w:p>
     <w:p>
       <w:pPr>
@@ -40802,7 +40616,6 @@
       </w:pPr>
       <w:bookmarkStart w:id="111" w:name="_Toc156204979"/>
       <w:r>
-        <w:lastRenderedPageBreak/>
         <w:t>Diagrams</w:t>
       </w:r>
       <w:bookmarkEnd w:id="111"/>
@@ -41125,7 +40938,6 @@
         <w:rPr>
           <w:rFonts w:eastAsiaTheme="minorHAnsi"/>
         </w:rPr>
-        <w:lastRenderedPageBreak/>
         <w:t>Delivery</w:t>
       </w:r>
       <w:bookmarkEnd w:id="115"/>
@@ -41522,7 +41334,6 @@
         <w:rPr>
           <w:rFonts w:eastAsiaTheme="minorHAnsi"/>
         </w:rPr>
-        <w:lastRenderedPageBreak/>
         <w:t>Performance</w:t>
       </w:r>
       <w:bookmarkEnd w:id="127"/>
@@ -41797,7 +41608,6 @@
         <w:rPr>
           <w:lang w:eastAsia="en-NZ"/>
         </w:rPr>
-        <w:lastRenderedPageBreak/>
         <w:t>Appropriateness recognisability</w:t>
       </w:r>
       <w:bookmarkEnd w:id="135"/>
@@ -42418,7 +42228,6 @@
         <w:rPr>
           <w:rFonts w:eastAsiaTheme="minorHAnsi"/>
         </w:rPr>
-        <w:lastRenderedPageBreak/>
         <w:t>Maintainability</w:t>
       </w:r>
       <w:bookmarkEnd w:id="146"/>
@@ -42730,7 +42539,7 @@
 </file>
 
 <file path=word/endnotes.xml><?xml version="1.0" encoding="utf-8"?>
-<w:endnotes xmlns:wpc="http://schemas.microsoft.com/office/word/2010/wordprocessingCanvas" xmlns:cx="http://schemas.microsoft.com/office/drawing/2014/chartex" xmlns:cx1="http://schemas.microsoft.com/office/drawing/2015/9/8/chartex" xmlns:cx2="http://schemas.microsoft.com/office/drawing/2015/10/21/chartex" xmlns:cx3="http://schemas.microsoft.com/office/drawing/2016/5/9/chartex" xmlns:cx4="http://schemas.microsoft.com/office/drawing/2016/5/10/chartex" xmlns:cx5="http://schemas.microsoft.com/office/drawing/2016/5/11/chartex" xmlns:cx6="http://schemas.microsoft.com/office/drawing/2016/5/12/chartex" xmlns:cx7="http://schemas.microsoft.com/office/drawing/2016/5/13/chartex" xmlns:cx8="http://schemas.microsoft.com/office/drawing/2016/5/14/chartex" xmlns:mc="http://schemas.openxmlformats.org/markup-compatibility/2006" xmlns:aink="http://schemas.microsoft.com/office/drawing/2016/ink" xmlns:am3d="http://schemas.microsoft.com/office/drawing/2017/model3d" xmlns:o="urn:schemas-microsoft-com:office:office" xmlns:oel="http://schemas.microsoft.com/office/2019/extlst" xmlns:r="http://schemas.openxmlformats.org/officeDocument/2006/relationships" xmlns:m="http://schemas.openxmlformats.org/officeDocument/2006/math" xmlns:v="urn:schemas-microsoft-com:vml" xmlns:wp14="http://schemas.microsoft.com/office/word/2010/wordprocessingDrawing" xmlns:wp="http://schemas.openxmlformats.org/drawingml/2006/wordprocessingDrawing" xmlns:w10="urn:schemas-microsoft-com:office:word" xmlns:w="http://schemas.openxmlformats.org/wordprocessingml/2006/main" xmlns:w14="http://schemas.microsoft.com/office/word/2010/wordml" xmlns:w15="http://schemas.microsoft.com/office/word/2012/wordml" xmlns:w16cex="http://schemas.microsoft.com/office/word/2018/wordml/cex" xmlns:w16cid="http://schemas.microsoft.com/office/word/2016/wordml/cid" xmlns:w16="http://schemas.microsoft.com/office/word/2018/wordml" xmlns:w16sdtdh="http://schemas.microsoft.com/office/word/2020/wordml/sdtdatahash" xmlns:w16se="http://schemas.microsoft.com/office/word/2015/wordml/symex" xmlns:wpg="http://schemas.microsoft.com/office/word/2010/wordprocessingGroup" xmlns:wpi="http://schemas.microsoft.com/office/word/2010/wordprocessingInk" xmlns:wne="http://schemas.microsoft.com/office/word/2006/wordml" xmlns:wps="http://schemas.microsoft.com/office/word/2010/wordprocessingShape" mc:Ignorable="w14 w15 w16se w16cid w16 w16cex w16sdtdh wp14">
+<w:endnotes xmlns:wpc="http://schemas.microsoft.com/office/word/2010/wordprocessingCanvas" xmlns:cx="http://schemas.microsoft.com/office/drawing/2014/chartex" xmlns:cx1="http://schemas.microsoft.com/office/drawing/2015/9/8/chartex" xmlns:cx2="http://schemas.microsoft.com/office/drawing/2015/10/21/chartex" xmlns:cx3="http://schemas.microsoft.com/office/drawing/2016/5/9/chartex" xmlns:cx4="http://schemas.microsoft.com/office/drawing/2016/5/10/chartex" xmlns:cx5="http://schemas.microsoft.com/office/drawing/2016/5/11/chartex" xmlns:cx6="http://schemas.microsoft.com/office/drawing/2016/5/12/chartex" xmlns:cx7="http://schemas.microsoft.com/office/drawing/2016/5/13/chartex" xmlns:cx8="http://schemas.microsoft.com/office/drawing/2016/5/14/chartex" xmlns:mc="http://schemas.openxmlformats.org/markup-compatibility/2006" xmlns:aink="http://schemas.microsoft.com/office/drawing/2016/ink" xmlns:am3d="http://schemas.microsoft.com/office/drawing/2017/model3d" xmlns:o="urn:schemas-microsoft-com:office:office" xmlns:oel="http://schemas.microsoft.com/office/2019/extlst" xmlns:r="http://schemas.openxmlformats.org/officeDocument/2006/relationships" xmlns:m="http://schemas.openxmlformats.org/officeDocument/2006/math" xmlns:v="urn:schemas-microsoft-com:vml" xmlns:wp14="http://schemas.microsoft.com/office/word/2010/wordprocessingDrawing" xmlns:wp="http://schemas.openxmlformats.org/drawingml/2006/wordprocessingDrawing" xmlns:w10="urn:schemas-microsoft-com:office:word" xmlns:w="http://schemas.openxmlformats.org/wordprocessingml/2006/main" xmlns:w14="http://schemas.microsoft.com/office/word/2010/wordml" xmlns:w15="http://schemas.microsoft.com/office/word/2012/wordml" xmlns:w16cex="http://schemas.microsoft.com/office/word/2018/wordml/cex" xmlns:w16cid="http://schemas.microsoft.com/office/word/2016/wordml/cid" xmlns:w16="http://schemas.microsoft.com/office/word/2018/wordml" xmlns:w16du="http://schemas.microsoft.com/office/word/2023/wordml/word16du" xmlns:w16sdtdh="http://schemas.microsoft.com/office/word/2020/wordml/sdtdatahash" xmlns:w16sdtfl="http://schemas.microsoft.com/office/word/2024/wordml/sdtformatlock" xmlns:w16se="http://schemas.microsoft.com/office/word/2015/wordml/symex" xmlns:wpg="http://schemas.microsoft.com/office/word/2010/wordprocessingGroup" xmlns:wpi="http://schemas.microsoft.com/office/word/2010/wordprocessingInk" xmlns:wne="http://schemas.microsoft.com/office/word/2006/wordml" xmlns:wps="http://schemas.microsoft.com/office/word/2010/wordprocessingShape" mc:Ignorable="w14 w15 w16se w16cid w16 w16cex w16sdtdh w16sdtfl w16du wp14">
   <w:endnote w:type="separator" w:id="-1">
     <w:p>
       <w:pPr>
@@ -42765,7 +42574,7 @@
 </file>
 
 <file path=word/footer1.xml><?xml version="1.0" encoding="utf-8"?>
-<w:ftr xmlns:wpc="http://schemas.microsoft.com/office/word/2010/wordprocessingCanvas" xmlns:cx="http://schemas.microsoft.com/office/drawing/2014/chartex" xmlns:cx1="http://schemas.microsoft.com/office/drawing/2015/9/8/chartex" xmlns:cx2="http://schemas.microsoft.com/office/drawing/2015/10/21/chartex" xmlns:cx3="http://schemas.microsoft.com/office/drawing/2016/5/9/chartex" xmlns:cx4="http://schemas.microsoft.com/office/drawing/2016/5/10/chartex" xmlns:cx5="http://schemas.microsoft.com/office/drawing/2016/5/11/chartex" xmlns:cx6="http://schemas.microsoft.com/office/drawing/2016/5/12/chartex" xmlns:cx7="http://schemas.microsoft.com/office/drawing/2016/5/13/chartex" xmlns:cx8="http://schemas.microsoft.com/office/drawing/2016/5/14/chartex" xmlns:mc="http://schemas.openxmlformats.org/markup-compatibility/2006" xmlns:aink="http://schemas.microsoft.com/office/drawing/2016/ink" xmlns:am3d="http://schemas.microsoft.com/office/drawing/2017/model3d" xmlns:o="urn:schemas-microsoft-com:office:office" xmlns:oel="http://schemas.microsoft.com/office/2019/extlst" xmlns:r="http://schemas.openxmlformats.org/officeDocument/2006/relationships" xmlns:m="http://schemas.openxmlformats.org/officeDocument/2006/math" xmlns:v="urn:schemas-microsoft-com:vml" xmlns:wp14="http://schemas.microsoft.com/office/word/2010/wordprocessingDrawing" xmlns:wp="http://schemas.openxmlformats.org/drawingml/2006/wordprocessingDrawing" xmlns:w10="urn:schemas-microsoft-com:office:word" xmlns:w="http://schemas.openxmlformats.org/wordprocessingml/2006/main" xmlns:w14="http://schemas.microsoft.com/office/word/2010/wordml" xmlns:w15="http://schemas.microsoft.com/office/word/2012/wordml" xmlns:w16cex="http://schemas.microsoft.com/office/word/2018/wordml/cex" xmlns:w16cid="http://schemas.microsoft.com/office/word/2016/wordml/cid" xmlns:w16="http://schemas.microsoft.com/office/word/2018/wordml" xmlns:w16sdtdh="http://schemas.microsoft.com/office/word/2020/wordml/sdtdatahash" xmlns:w16se="http://schemas.microsoft.com/office/word/2015/wordml/symex" xmlns:wpg="http://schemas.microsoft.com/office/word/2010/wordprocessingGroup" xmlns:wpi="http://schemas.microsoft.com/office/word/2010/wordprocessingInk" xmlns:wne="http://schemas.microsoft.com/office/word/2006/wordml" xmlns:wps="http://schemas.microsoft.com/office/word/2010/wordprocessingShape" mc:Ignorable="w14 w15 w16se w16cid w16 w16cex w16sdtdh wp14">
+<w:ftr xmlns:wpc="http://schemas.microsoft.com/office/word/2010/wordprocessingCanvas" xmlns:cx="http://schemas.microsoft.com/office/drawing/2014/chartex" xmlns:cx1="http://schemas.microsoft.com/office/drawing/2015/9/8/chartex" xmlns:cx2="http://schemas.microsoft.com/office/drawing/2015/10/21/chartex" xmlns:cx3="http://schemas.microsoft.com/office/drawing/2016/5/9/chartex" xmlns:cx4="http://schemas.microsoft.com/office/drawing/2016/5/10/chartex" xmlns:cx5="http://schemas.microsoft.com/office/drawing/2016/5/11/chartex" xmlns:cx6="http://schemas.microsoft.com/office/drawing/2016/5/12/chartex" xmlns:cx7="http://schemas.microsoft.com/office/drawing/2016/5/13/chartex" xmlns:cx8="http://schemas.microsoft.com/office/drawing/2016/5/14/chartex" xmlns:mc="http://schemas.openxmlformats.org/markup-compatibility/2006" xmlns:aink="http://schemas.microsoft.com/office/drawing/2016/ink" xmlns:am3d="http://schemas.microsoft.com/office/drawing/2017/model3d" xmlns:o="urn:schemas-microsoft-com:office:office" xmlns:oel="http://schemas.microsoft.com/office/2019/extlst" xmlns:r="http://schemas.openxmlformats.org/officeDocument/2006/relationships" xmlns:m="http://schemas.openxmlformats.org/officeDocument/2006/math" xmlns:v="urn:schemas-microsoft-com:vml" xmlns:wp14="http://schemas.microsoft.com/office/word/2010/wordprocessingDrawing" xmlns:wp="http://schemas.openxmlformats.org/drawingml/2006/wordprocessingDrawing" xmlns:w10="urn:schemas-microsoft-com:office:word" xmlns:w="http://schemas.openxmlformats.org/wordprocessingml/2006/main" xmlns:w14="http://schemas.microsoft.com/office/word/2010/wordml" xmlns:w15="http://schemas.microsoft.com/office/word/2012/wordml" xmlns:w16cex="http://schemas.microsoft.com/office/word/2018/wordml/cex" xmlns:w16cid="http://schemas.microsoft.com/office/word/2016/wordml/cid" xmlns:w16="http://schemas.microsoft.com/office/word/2018/wordml" xmlns:w16du="http://schemas.microsoft.com/office/word/2023/wordml/word16du" xmlns:w16sdtdh="http://schemas.microsoft.com/office/word/2020/wordml/sdtdatahash" xmlns:w16sdtfl="http://schemas.microsoft.com/office/word/2024/wordml/sdtformatlock" xmlns:w16se="http://schemas.microsoft.com/office/word/2015/wordml/symex" xmlns:wpg="http://schemas.microsoft.com/office/word/2010/wordprocessingGroup" xmlns:wpi="http://schemas.microsoft.com/office/word/2010/wordprocessingInk" xmlns:wne="http://schemas.microsoft.com/office/word/2006/wordml" xmlns:wps="http://schemas.microsoft.com/office/word/2010/wordprocessingShape" mc:Ignorable="w14 w15 w16se w16cid w16 w16cex w16sdtdh w16sdtfl w16du wp14">
   <w:p>
     <w:pPr>
       <w:pStyle w:val="Footer"/>
@@ -42896,7 +42705,7 @@
 </file>
 
 <file path=word/footer2.xml><?xml version="1.0" encoding="utf-8"?>
-<w:ftr xmlns:wpc="http://schemas.microsoft.com/office/word/2010/wordprocessingCanvas" xmlns:cx="http://schemas.microsoft.com/office/drawing/2014/chartex" xmlns:cx1="http://schemas.microsoft.com/office/drawing/2015/9/8/chartex" xmlns:cx2="http://schemas.microsoft.com/office/drawing/2015/10/21/chartex" xmlns:cx3="http://schemas.microsoft.com/office/drawing/2016/5/9/chartex" xmlns:cx4="http://schemas.microsoft.com/office/drawing/2016/5/10/chartex" xmlns:cx5="http://schemas.microsoft.com/office/drawing/2016/5/11/chartex" xmlns:cx6="http://schemas.microsoft.com/office/drawing/2016/5/12/chartex" xmlns:cx7="http://schemas.microsoft.com/office/drawing/2016/5/13/chartex" xmlns:cx8="http://schemas.microsoft.com/office/drawing/2016/5/14/chartex" xmlns:mc="http://schemas.openxmlformats.org/markup-compatibility/2006" xmlns:aink="http://schemas.microsoft.com/office/drawing/2016/ink" xmlns:am3d="http://schemas.microsoft.com/office/drawing/2017/model3d" xmlns:o="urn:schemas-microsoft-com:office:office" xmlns:oel="http://schemas.microsoft.com/office/2019/extlst" xmlns:r="http://schemas.openxmlformats.org/officeDocument/2006/relationships" xmlns:m="http://schemas.openxmlformats.org/officeDocument/2006/math" xmlns:v="urn:schemas-microsoft-com:vml" xmlns:wp14="http://schemas.microsoft.com/office/word/2010/wordprocessingDrawing" xmlns:wp="http://schemas.openxmlformats.org/drawingml/2006/wordprocessingDrawing" xmlns:w10="urn:schemas-microsoft-com:office:word" xmlns:w="http://schemas.openxmlformats.org/wordprocessingml/2006/main" xmlns:w14="http://schemas.microsoft.com/office/word/2010/wordml" xmlns:w15="http://schemas.microsoft.com/office/word/2012/wordml" xmlns:w16cex="http://schemas.microsoft.com/office/word/2018/wordml/cex" xmlns:w16cid="http://schemas.microsoft.com/office/word/2016/wordml/cid" xmlns:w16="http://schemas.microsoft.com/office/word/2018/wordml" xmlns:w16sdtdh="http://schemas.microsoft.com/office/word/2020/wordml/sdtdatahash" xmlns:w16se="http://schemas.microsoft.com/office/word/2015/wordml/symex" xmlns:wpg="http://schemas.microsoft.com/office/word/2010/wordprocessingGroup" xmlns:wpi="http://schemas.microsoft.com/office/word/2010/wordprocessingInk" xmlns:wne="http://schemas.microsoft.com/office/word/2006/wordml" xmlns:wps="http://schemas.microsoft.com/office/word/2010/wordprocessingShape" mc:Ignorable="w14 w15 w16se w16cid w16 w16cex w16sdtdh wp14">
+<w:ftr xmlns:wpc="http://schemas.microsoft.com/office/word/2010/wordprocessingCanvas" xmlns:cx="http://schemas.microsoft.com/office/drawing/2014/chartex" xmlns:cx1="http://schemas.microsoft.com/office/drawing/2015/9/8/chartex" xmlns:cx2="http://schemas.microsoft.com/office/drawing/2015/10/21/chartex" xmlns:cx3="http://schemas.microsoft.com/office/drawing/2016/5/9/chartex" xmlns:cx4="http://schemas.microsoft.com/office/drawing/2016/5/10/chartex" xmlns:cx5="http://schemas.microsoft.com/office/drawing/2016/5/11/chartex" xmlns:cx6="http://schemas.microsoft.com/office/drawing/2016/5/12/chartex" xmlns:cx7="http://schemas.microsoft.com/office/drawing/2016/5/13/chartex" xmlns:cx8="http://schemas.microsoft.com/office/drawing/2016/5/14/chartex" xmlns:mc="http://schemas.openxmlformats.org/markup-compatibility/2006" xmlns:aink="http://schemas.microsoft.com/office/drawing/2016/ink" xmlns:am3d="http://schemas.microsoft.com/office/drawing/2017/model3d" xmlns:o="urn:schemas-microsoft-com:office:office" xmlns:oel="http://schemas.microsoft.com/office/2019/extlst" xmlns:r="http://schemas.openxmlformats.org/officeDocument/2006/relationships" xmlns:m="http://schemas.openxmlformats.org/officeDocument/2006/math" xmlns:v="urn:schemas-microsoft-com:vml" xmlns:wp14="http://schemas.microsoft.com/office/word/2010/wordprocessingDrawing" xmlns:wp="http://schemas.openxmlformats.org/drawingml/2006/wordprocessingDrawing" xmlns:w10="urn:schemas-microsoft-com:office:word" xmlns:w="http://schemas.openxmlformats.org/wordprocessingml/2006/main" xmlns:w14="http://schemas.microsoft.com/office/word/2010/wordml" xmlns:w15="http://schemas.microsoft.com/office/word/2012/wordml" xmlns:w16cex="http://schemas.microsoft.com/office/word/2018/wordml/cex" xmlns:w16cid="http://schemas.microsoft.com/office/word/2016/wordml/cid" xmlns:w16="http://schemas.microsoft.com/office/word/2018/wordml" xmlns:w16du="http://schemas.microsoft.com/office/word/2023/wordml/word16du" xmlns:w16sdtdh="http://schemas.microsoft.com/office/word/2020/wordml/sdtdatahash" xmlns:w16sdtfl="http://schemas.microsoft.com/office/word/2024/wordml/sdtformatlock" xmlns:w16se="http://schemas.microsoft.com/office/word/2015/wordml/symex" xmlns:wpg="http://schemas.microsoft.com/office/word/2010/wordprocessingGroup" xmlns:wpi="http://schemas.microsoft.com/office/word/2010/wordprocessingInk" xmlns:wne="http://schemas.microsoft.com/office/word/2006/wordml" xmlns:wps="http://schemas.microsoft.com/office/word/2010/wordprocessingShape" mc:Ignorable="w14 w15 w16se w16cid w16 w16cex w16sdtdh w16sdtfl w16du wp14">
   <w:p>
     <w:pPr>
       <w:pStyle w:val="Footer"/>
@@ -43069,7 +42878,7 @@
 </file>
 
 <file path=word/footer3.xml><?xml version="1.0" encoding="utf-8"?>
-<w:ftr xmlns:wpc="http://schemas.microsoft.com/office/word/2010/wordprocessingCanvas" xmlns:cx="http://schemas.microsoft.com/office/drawing/2014/chartex" xmlns:cx1="http://schemas.microsoft.com/office/drawing/2015/9/8/chartex" xmlns:cx2="http://schemas.microsoft.com/office/drawing/2015/10/21/chartex" xmlns:cx3="http://schemas.microsoft.com/office/drawing/2016/5/9/chartex" xmlns:cx4="http://schemas.microsoft.com/office/drawing/2016/5/10/chartex" xmlns:cx5="http://schemas.microsoft.com/office/drawing/2016/5/11/chartex" xmlns:cx6="http://schemas.microsoft.com/office/drawing/2016/5/12/chartex" xmlns:cx7="http://schemas.microsoft.com/office/drawing/2016/5/13/chartex" xmlns:cx8="http://schemas.microsoft.com/office/drawing/2016/5/14/chartex" xmlns:mc="http://schemas.openxmlformats.org/markup-compatibility/2006" xmlns:aink="http://schemas.microsoft.com/office/drawing/2016/ink" xmlns:am3d="http://schemas.microsoft.com/office/drawing/2017/model3d" xmlns:o="urn:schemas-microsoft-com:office:office" xmlns:oel="http://schemas.microsoft.com/office/2019/extlst" xmlns:r="http://schemas.openxmlformats.org/officeDocument/2006/relationships" xmlns:m="http://schemas.openxmlformats.org/officeDocument/2006/math" xmlns:v="urn:schemas-microsoft-com:vml" xmlns:wp14="http://schemas.microsoft.com/office/word/2010/wordprocessingDrawing" xmlns:wp="http://schemas.openxmlformats.org/drawingml/2006/wordprocessingDrawing" xmlns:w10="urn:schemas-microsoft-com:office:word" xmlns:w="http://schemas.openxmlformats.org/wordprocessingml/2006/main" xmlns:w14="http://schemas.microsoft.com/office/word/2010/wordml" xmlns:w15="http://schemas.microsoft.com/office/word/2012/wordml" xmlns:w16cex="http://schemas.microsoft.com/office/word/2018/wordml/cex" xmlns:w16cid="http://schemas.microsoft.com/office/word/2016/wordml/cid" xmlns:w16="http://schemas.microsoft.com/office/word/2018/wordml" xmlns:w16sdtdh="http://schemas.microsoft.com/office/word/2020/wordml/sdtdatahash" xmlns:w16se="http://schemas.microsoft.com/office/word/2015/wordml/symex" xmlns:wpg="http://schemas.microsoft.com/office/word/2010/wordprocessingGroup" xmlns:wpi="http://schemas.microsoft.com/office/word/2010/wordprocessingInk" xmlns:wne="http://schemas.microsoft.com/office/word/2006/wordml" xmlns:wps="http://schemas.microsoft.com/office/word/2010/wordprocessingShape" mc:Ignorable="w14 w15 w16se w16cid w16 w16cex w16sdtdh wp14">
+<w:ftr xmlns:wpc="http://schemas.microsoft.com/office/word/2010/wordprocessingCanvas" xmlns:cx="http://schemas.microsoft.com/office/drawing/2014/chartex" xmlns:cx1="http://schemas.microsoft.com/office/drawing/2015/9/8/chartex" xmlns:cx2="http://schemas.microsoft.com/office/drawing/2015/10/21/chartex" xmlns:cx3="http://schemas.microsoft.com/office/drawing/2016/5/9/chartex" xmlns:cx4="http://schemas.microsoft.com/office/drawing/2016/5/10/chartex" xmlns:cx5="http://schemas.microsoft.com/office/drawing/2016/5/11/chartex" xmlns:cx6="http://schemas.microsoft.com/office/drawing/2016/5/12/chartex" xmlns:cx7="http://schemas.microsoft.com/office/drawing/2016/5/13/chartex" xmlns:cx8="http://schemas.microsoft.com/office/drawing/2016/5/14/chartex" xmlns:mc="http://schemas.openxmlformats.org/markup-compatibility/2006" xmlns:aink="http://schemas.microsoft.com/office/drawing/2016/ink" xmlns:am3d="http://schemas.microsoft.com/office/drawing/2017/model3d" xmlns:o="urn:schemas-microsoft-com:office:office" xmlns:oel="http://schemas.microsoft.com/office/2019/extlst" xmlns:r="http://schemas.openxmlformats.org/officeDocument/2006/relationships" xmlns:m="http://schemas.openxmlformats.org/officeDocument/2006/math" xmlns:v="urn:schemas-microsoft-com:vml" xmlns:wp14="http://schemas.microsoft.com/office/word/2010/wordprocessingDrawing" xmlns:wp="http://schemas.openxmlformats.org/drawingml/2006/wordprocessingDrawing" xmlns:w10="urn:schemas-microsoft-com:office:word" xmlns:w="http://schemas.openxmlformats.org/wordprocessingml/2006/main" xmlns:w14="http://schemas.microsoft.com/office/word/2010/wordml" xmlns:w15="http://schemas.microsoft.com/office/word/2012/wordml" xmlns:w16cex="http://schemas.microsoft.com/office/word/2018/wordml/cex" xmlns:w16cid="http://schemas.microsoft.com/office/word/2016/wordml/cid" xmlns:w16="http://schemas.microsoft.com/office/word/2018/wordml" xmlns:w16du="http://schemas.microsoft.com/office/word/2023/wordml/word16du" xmlns:w16sdtdh="http://schemas.microsoft.com/office/word/2020/wordml/sdtdatahash" xmlns:w16sdtfl="http://schemas.microsoft.com/office/word/2024/wordml/sdtformatlock" xmlns:w16se="http://schemas.microsoft.com/office/word/2015/wordml/symex" xmlns:wpg="http://schemas.microsoft.com/office/word/2010/wordprocessingGroup" xmlns:wpi="http://schemas.microsoft.com/office/word/2010/wordprocessingInk" xmlns:wne="http://schemas.microsoft.com/office/word/2006/wordml" xmlns:wps="http://schemas.microsoft.com/office/word/2010/wordprocessingShape" mc:Ignorable="w14 w15 w16se w16cid w16 w16cex w16sdtdh w16sdtfl w16du wp14">
   <w:p>
     <w:pPr>
       <w:pStyle w:val="Footer"/>
@@ -43236,7 +43045,7 @@
 </file>
 
 <file path=word/footnotes.xml><?xml version="1.0" encoding="utf-8"?>
-<w:footnotes xmlns:wpc="http://schemas.microsoft.com/office/word/2010/wordprocessingCanvas" xmlns:cx="http://schemas.microsoft.com/office/drawing/2014/chartex" xmlns:cx1="http://schemas.microsoft.com/office/drawing/2015/9/8/chartex" xmlns:cx2="http://schemas.microsoft.com/office/drawing/2015/10/21/chartex" xmlns:cx3="http://schemas.microsoft.com/office/drawing/2016/5/9/chartex" xmlns:cx4="http://schemas.microsoft.com/office/drawing/2016/5/10/chartex" xmlns:cx5="http://schemas.microsoft.com/office/drawing/2016/5/11/chartex" xmlns:cx6="http://schemas.microsoft.com/office/drawing/2016/5/12/chartex" xmlns:cx7="http://schemas.microsoft.com/office/drawing/2016/5/13/chartex" xmlns:cx8="http://schemas.microsoft.com/office/drawing/2016/5/14/chartex" xmlns:mc="http://schemas.openxmlformats.org/markup-compatibility/2006" xmlns:aink="http://schemas.microsoft.com/office/drawing/2016/ink" xmlns:am3d="http://schemas.microsoft.com/office/drawing/2017/model3d" xmlns:o="urn:schemas-microsoft-com:office:office" xmlns:oel="http://schemas.microsoft.com/office/2019/extlst" xmlns:r="http://schemas.openxmlformats.org/officeDocument/2006/relationships" xmlns:m="http://schemas.openxmlformats.org/officeDocument/2006/math" xmlns:v="urn:schemas-microsoft-com:vml" xmlns:wp14="http://schemas.microsoft.com/office/word/2010/wordprocessingDrawing" xmlns:wp="http://schemas.openxmlformats.org/drawingml/2006/wordprocessingDrawing" xmlns:w10="urn:schemas-microsoft-com:office:word" xmlns:w="http://schemas.openxmlformats.org/wordprocessingml/2006/main" xmlns:w14="http://schemas.microsoft.com/office/word/2010/wordml" xmlns:w15="http://schemas.microsoft.com/office/word/2012/wordml" xmlns:w16cex="http://schemas.microsoft.com/office/word/2018/wordml/cex" xmlns:w16cid="http://schemas.microsoft.com/office/word/2016/wordml/cid" xmlns:w16="http://schemas.microsoft.com/office/word/2018/wordml" xmlns:w16sdtdh="http://schemas.microsoft.com/office/word/2020/wordml/sdtdatahash" xmlns:w16se="http://schemas.microsoft.com/office/word/2015/wordml/symex" xmlns:wpg="http://schemas.microsoft.com/office/word/2010/wordprocessingGroup" xmlns:wpi="http://schemas.microsoft.com/office/word/2010/wordprocessingInk" xmlns:wne="http://schemas.microsoft.com/office/word/2006/wordml" xmlns:wps="http://schemas.microsoft.com/office/word/2010/wordprocessingShape" mc:Ignorable="w14 w15 w16se w16cid w16 w16cex w16sdtdh wp14">
+<w:footnotes xmlns:wpc="http://schemas.microsoft.com/office/word/2010/wordprocessingCanvas" xmlns:cx="http://schemas.microsoft.com/office/drawing/2014/chartex" xmlns:cx1="http://schemas.microsoft.com/office/drawing/2015/9/8/chartex" xmlns:cx2="http://schemas.microsoft.com/office/drawing/2015/10/21/chartex" xmlns:cx3="http://schemas.microsoft.com/office/drawing/2016/5/9/chartex" xmlns:cx4="http://schemas.microsoft.com/office/drawing/2016/5/10/chartex" xmlns:cx5="http://schemas.microsoft.com/office/drawing/2016/5/11/chartex" xmlns:cx6="http://schemas.microsoft.com/office/drawing/2016/5/12/chartex" xmlns:cx7="http://schemas.microsoft.com/office/drawing/2016/5/13/chartex" xmlns:cx8="http://schemas.microsoft.com/office/drawing/2016/5/14/chartex" xmlns:mc="http://schemas.openxmlformats.org/markup-compatibility/2006" xmlns:aink="http://schemas.microsoft.com/office/drawing/2016/ink" xmlns:am3d="http://schemas.microsoft.com/office/drawing/2017/model3d" xmlns:o="urn:schemas-microsoft-com:office:office" xmlns:oel="http://schemas.microsoft.com/office/2019/extlst" xmlns:r="http://schemas.openxmlformats.org/officeDocument/2006/relationships" xmlns:m="http://schemas.openxmlformats.org/officeDocument/2006/math" xmlns:v="urn:schemas-microsoft-com:vml" xmlns:wp14="http://schemas.microsoft.com/office/word/2010/wordprocessingDrawing" xmlns:wp="http://schemas.openxmlformats.org/drawingml/2006/wordprocessingDrawing" xmlns:w10="urn:schemas-microsoft-com:office:word" xmlns:w="http://schemas.openxmlformats.org/wordprocessingml/2006/main" xmlns:w14="http://schemas.microsoft.com/office/word/2010/wordml" xmlns:w15="http://schemas.microsoft.com/office/word/2012/wordml" xmlns:w16cex="http://schemas.microsoft.com/office/word/2018/wordml/cex" xmlns:w16cid="http://schemas.microsoft.com/office/word/2016/wordml/cid" xmlns:w16="http://schemas.microsoft.com/office/word/2018/wordml" xmlns:w16du="http://schemas.microsoft.com/office/word/2023/wordml/word16du" xmlns:w16sdtdh="http://schemas.microsoft.com/office/word/2020/wordml/sdtdatahash" xmlns:w16sdtfl="http://schemas.microsoft.com/office/word/2024/wordml/sdtformatlock" xmlns:w16se="http://schemas.microsoft.com/office/word/2015/wordml/symex" xmlns:wpg="http://schemas.microsoft.com/office/word/2010/wordprocessingGroup" xmlns:wpi="http://schemas.microsoft.com/office/word/2010/wordprocessingInk" xmlns:wne="http://schemas.microsoft.com/office/word/2006/wordml" xmlns:wps="http://schemas.microsoft.com/office/word/2010/wordprocessingShape" mc:Ignorable="w14 w15 w16se w16cid w16 w16cex w16sdtdh w16sdtfl w16du wp14">
   <w:footnote w:type="separator" w:id="-1">
     <w:p>
       <w:pPr>
@@ -43271,7 +43080,7 @@
 </file>
 
 <file path=word/header1.xml><?xml version="1.0" encoding="utf-8"?>
-<w:hdr xmlns:wpc="http://schemas.microsoft.com/office/word/2010/wordprocessingCanvas" xmlns:cx="http://schemas.microsoft.com/office/drawing/2014/chartex" xmlns:cx1="http://schemas.microsoft.com/office/drawing/2015/9/8/chartex" xmlns:cx2="http://schemas.microsoft.com/office/drawing/2015/10/21/chartex" xmlns:cx3="http://schemas.microsoft.com/office/drawing/2016/5/9/chartex" xmlns:cx4="http://schemas.microsoft.com/office/drawing/2016/5/10/chartex" xmlns:cx5="http://schemas.microsoft.com/office/drawing/2016/5/11/chartex" xmlns:cx6="http://schemas.microsoft.com/office/drawing/2016/5/12/chartex" xmlns:cx7="http://schemas.microsoft.com/office/drawing/2016/5/13/chartex" xmlns:cx8="http://schemas.microsoft.com/office/drawing/2016/5/14/chartex" xmlns:mc="http://schemas.openxmlformats.org/markup-compatibility/2006" xmlns:aink="http://schemas.microsoft.com/office/drawing/2016/ink" xmlns:am3d="http://schemas.microsoft.com/office/drawing/2017/model3d" xmlns:o="urn:schemas-microsoft-com:office:office" xmlns:oel="http://schemas.microsoft.com/office/2019/extlst" xmlns:r="http://schemas.openxmlformats.org/officeDocument/2006/relationships" xmlns:m="http://schemas.openxmlformats.org/officeDocument/2006/math" xmlns:v="urn:schemas-microsoft-com:vml" xmlns:wp14="http://schemas.microsoft.com/office/word/2010/wordprocessingDrawing" xmlns:wp="http://schemas.openxmlformats.org/drawingml/2006/wordprocessingDrawing" xmlns:w10="urn:schemas-microsoft-com:office:word" xmlns:w="http://schemas.openxmlformats.org/wordprocessingml/2006/main" xmlns:w14="http://schemas.microsoft.com/office/word/2010/wordml" xmlns:w15="http://schemas.microsoft.com/office/word/2012/wordml" xmlns:w16cex="http://schemas.microsoft.com/office/word/2018/wordml/cex" xmlns:w16cid="http://schemas.microsoft.com/office/word/2016/wordml/cid" xmlns:w16="http://schemas.microsoft.com/office/word/2018/wordml" xmlns:w16sdtdh="http://schemas.microsoft.com/office/word/2020/wordml/sdtdatahash" xmlns:w16se="http://schemas.microsoft.com/office/word/2015/wordml/symex" xmlns:wpg="http://schemas.microsoft.com/office/word/2010/wordprocessingGroup" xmlns:wpi="http://schemas.microsoft.com/office/word/2010/wordprocessingInk" xmlns:wne="http://schemas.microsoft.com/office/word/2006/wordml" xmlns:wps="http://schemas.microsoft.com/office/word/2010/wordprocessingShape" mc:Ignorable="w14 w15 w16se w16cid w16 w16cex w16sdtdh wp14">
+<w:hdr xmlns:wpc="http://schemas.microsoft.com/office/word/2010/wordprocessingCanvas" xmlns:cx="http://schemas.microsoft.com/office/drawing/2014/chartex" xmlns:cx1="http://schemas.microsoft.com/office/drawing/2015/9/8/chartex" xmlns:cx2="http://schemas.microsoft.com/office/drawing/2015/10/21/chartex" xmlns:cx3="http://schemas.microsoft.com/office/drawing/2016/5/9/chartex" xmlns:cx4="http://schemas.microsoft.com/office/drawing/2016/5/10/chartex" xmlns:cx5="http://schemas.microsoft.com/office/drawing/2016/5/11/chartex" xmlns:cx6="http://schemas.microsoft.com/office/drawing/2016/5/12/chartex" xmlns:cx7="http://schemas.microsoft.com/office/drawing/2016/5/13/chartex" xmlns:cx8="http://schemas.microsoft.com/office/drawing/2016/5/14/chartex" xmlns:mc="http://schemas.openxmlformats.org/markup-compatibility/2006" xmlns:aink="http://schemas.microsoft.com/office/drawing/2016/ink" xmlns:am3d="http://schemas.microsoft.com/office/drawing/2017/model3d" xmlns:o="urn:schemas-microsoft-com:office:office" xmlns:oel="http://schemas.microsoft.com/office/2019/extlst" xmlns:r="http://schemas.openxmlformats.org/officeDocument/2006/relationships" xmlns:m="http://schemas.openxmlformats.org/officeDocument/2006/math" xmlns:v="urn:schemas-microsoft-com:vml" xmlns:wp14="http://schemas.microsoft.com/office/word/2010/wordprocessingDrawing" xmlns:wp="http://schemas.openxmlformats.org/drawingml/2006/wordprocessingDrawing" xmlns:w10="urn:schemas-microsoft-com:office:word" xmlns:w="http://schemas.openxmlformats.org/wordprocessingml/2006/main" xmlns:w14="http://schemas.microsoft.com/office/word/2010/wordml" xmlns:w15="http://schemas.microsoft.com/office/word/2012/wordml" xmlns:w16cex="http://schemas.microsoft.com/office/word/2018/wordml/cex" xmlns:w16cid="http://schemas.microsoft.com/office/word/2016/wordml/cid" xmlns:w16="http://schemas.microsoft.com/office/word/2018/wordml" xmlns:w16du="http://schemas.microsoft.com/office/word/2023/wordml/word16du" xmlns:w16sdtdh="http://schemas.microsoft.com/office/word/2020/wordml/sdtdatahash" xmlns:w16sdtfl="http://schemas.microsoft.com/office/word/2024/wordml/sdtformatlock" xmlns:w16se="http://schemas.microsoft.com/office/word/2015/wordml/symex" xmlns:wpg="http://schemas.microsoft.com/office/word/2010/wordprocessingGroup" xmlns:wpi="http://schemas.microsoft.com/office/word/2010/wordprocessingInk" xmlns:wne="http://schemas.microsoft.com/office/word/2006/wordml" xmlns:wps="http://schemas.microsoft.com/office/word/2010/wordprocessingShape" mc:Ignorable="w14 w15 w16se w16cid w16 w16cex w16sdtdh w16sdtfl w16du wp14">
   <w:p>
     <w:pPr>
       <w:pStyle w:val="Header"/>
@@ -43402,7 +43211,7 @@
 </file>
 
 <file path=word/header2.xml><?xml version="1.0" encoding="utf-8"?>
-<w:hdr xmlns:wpc="http://schemas.microsoft.com/office/word/2010/wordprocessingCanvas" xmlns:cx="http://schemas.microsoft.com/office/drawing/2014/chartex" xmlns:cx1="http://schemas.microsoft.com/office/drawing/2015/9/8/chartex" xmlns:cx2="http://schemas.microsoft.com/office/drawing/2015/10/21/chartex" xmlns:cx3="http://schemas.microsoft.com/office/drawing/2016/5/9/chartex" xmlns:cx4="http://schemas.microsoft.com/office/drawing/2016/5/10/chartex" xmlns:cx5="http://schemas.microsoft.com/office/drawing/2016/5/11/chartex" xmlns:cx6="http://schemas.microsoft.com/office/drawing/2016/5/12/chartex" xmlns:cx7="http://schemas.microsoft.com/office/drawing/2016/5/13/chartex" xmlns:cx8="http://schemas.microsoft.com/office/drawing/2016/5/14/chartex" xmlns:mc="http://schemas.openxmlformats.org/markup-compatibility/2006" xmlns:aink="http://schemas.microsoft.com/office/drawing/2016/ink" xmlns:am3d="http://schemas.microsoft.com/office/drawing/2017/model3d" xmlns:o="urn:schemas-microsoft-com:office:office" xmlns:oel="http://schemas.microsoft.com/office/2019/extlst" xmlns:r="http://schemas.openxmlformats.org/officeDocument/2006/relationships" xmlns:m="http://schemas.openxmlformats.org/officeDocument/2006/math" xmlns:v="urn:schemas-microsoft-com:vml" xmlns:wp14="http://schemas.microsoft.com/office/word/2010/wordprocessingDrawing" xmlns:wp="http://schemas.openxmlformats.org/drawingml/2006/wordprocessingDrawing" xmlns:w10="urn:schemas-microsoft-com:office:word" xmlns:w="http://schemas.openxmlformats.org/wordprocessingml/2006/main" xmlns:w14="http://schemas.microsoft.com/office/word/2010/wordml" xmlns:w15="http://schemas.microsoft.com/office/word/2012/wordml" xmlns:w16cex="http://schemas.microsoft.com/office/word/2018/wordml/cex" xmlns:w16cid="http://schemas.microsoft.com/office/word/2016/wordml/cid" xmlns:w16="http://schemas.microsoft.com/office/word/2018/wordml" xmlns:w16sdtdh="http://schemas.microsoft.com/office/word/2020/wordml/sdtdatahash" xmlns:w16se="http://schemas.microsoft.com/office/word/2015/wordml/symex" xmlns:wpg="http://schemas.microsoft.com/office/word/2010/wordprocessingGroup" xmlns:wpi="http://schemas.microsoft.com/office/word/2010/wordprocessingInk" xmlns:wne="http://schemas.microsoft.com/office/word/2006/wordml" xmlns:wps="http://schemas.microsoft.com/office/word/2010/wordprocessingShape" mc:Ignorable="w14 w15 w16se w16cid w16 w16cex w16sdtdh wp14">
+<w:hdr xmlns:wpc="http://schemas.microsoft.com/office/word/2010/wordprocessingCanvas" xmlns:cx="http://schemas.microsoft.com/office/drawing/2014/chartex" xmlns:cx1="http://schemas.microsoft.com/office/drawing/2015/9/8/chartex" xmlns:cx2="http://schemas.microsoft.com/office/drawing/2015/10/21/chartex" xmlns:cx3="http://schemas.microsoft.com/office/drawing/2016/5/9/chartex" xmlns:cx4="http://schemas.microsoft.com/office/drawing/2016/5/10/chartex" xmlns:cx5="http://schemas.microsoft.com/office/drawing/2016/5/11/chartex" xmlns:cx6="http://schemas.microsoft.com/office/drawing/2016/5/12/chartex" xmlns:cx7="http://schemas.microsoft.com/office/drawing/2016/5/13/chartex" xmlns:cx8="http://schemas.microsoft.com/office/drawing/2016/5/14/chartex" xmlns:mc="http://schemas.openxmlformats.org/markup-compatibility/2006" xmlns:aink="http://schemas.microsoft.com/office/drawing/2016/ink" xmlns:am3d="http://schemas.microsoft.com/office/drawing/2017/model3d" xmlns:o="urn:schemas-microsoft-com:office:office" xmlns:oel="http://schemas.microsoft.com/office/2019/extlst" xmlns:r="http://schemas.openxmlformats.org/officeDocument/2006/relationships" xmlns:m="http://schemas.openxmlformats.org/officeDocument/2006/math" xmlns:v="urn:schemas-microsoft-com:vml" xmlns:wp14="http://schemas.microsoft.com/office/word/2010/wordprocessingDrawing" xmlns:wp="http://schemas.openxmlformats.org/drawingml/2006/wordprocessingDrawing" xmlns:w10="urn:schemas-microsoft-com:office:word" xmlns:w="http://schemas.openxmlformats.org/wordprocessingml/2006/main" xmlns:w14="http://schemas.microsoft.com/office/word/2010/wordml" xmlns:w15="http://schemas.microsoft.com/office/word/2012/wordml" xmlns:w16cex="http://schemas.microsoft.com/office/word/2018/wordml/cex" xmlns:w16cid="http://schemas.microsoft.com/office/word/2016/wordml/cid" xmlns:w16="http://schemas.microsoft.com/office/word/2018/wordml" xmlns:w16du="http://schemas.microsoft.com/office/word/2023/wordml/word16du" xmlns:w16sdtdh="http://schemas.microsoft.com/office/word/2020/wordml/sdtdatahash" xmlns:w16sdtfl="http://schemas.microsoft.com/office/word/2024/wordml/sdtformatlock" xmlns:w16se="http://schemas.microsoft.com/office/word/2015/wordml/symex" xmlns:wpg="http://schemas.microsoft.com/office/word/2010/wordprocessingGroup" xmlns:wpi="http://schemas.microsoft.com/office/word/2010/wordprocessingInk" xmlns:wne="http://schemas.microsoft.com/office/word/2006/wordml" xmlns:wps="http://schemas.microsoft.com/office/word/2010/wordprocessingShape" mc:Ignorable="w14 w15 w16se w16cid w16 w16cex w16sdtdh w16sdtfl w16du wp14">
   <w:p>
     <w:pPr>
       <w:pStyle w:val="Header"/>
@@ -43533,7 +43342,7 @@
 </file>
 
 <file path=word/header3.xml><?xml version="1.0" encoding="utf-8"?>
-<w:hdr xmlns:wpc="http://schemas.microsoft.com/office/word/2010/wordprocessingCanvas" xmlns:cx="http://schemas.microsoft.com/office/drawing/2014/chartex" xmlns:cx1="http://schemas.microsoft.com/office/drawing/2015/9/8/chartex" xmlns:cx2="http://schemas.microsoft.com/office/drawing/2015/10/21/chartex" xmlns:cx3="http://schemas.microsoft.com/office/drawing/2016/5/9/chartex" xmlns:cx4="http://schemas.microsoft.com/office/drawing/2016/5/10/chartex" xmlns:cx5="http://schemas.microsoft.com/office/drawing/2016/5/11/chartex" xmlns:cx6="http://schemas.microsoft.com/office/drawing/2016/5/12/chartex" xmlns:cx7="http://schemas.microsoft.com/office/drawing/2016/5/13/chartex" xmlns:cx8="http://schemas.microsoft.com/office/drawing/2016/5/14/chartex" xmlns:mc="http://schemas.openxmlformats.org/markup-compatibility/2006" xmlns:aink="http://schemas.microsoft.com/office/drawing/2016/ink" xmlns:am3d="http://schemas.microsoft.com/office/drawing/2017/model3d" xmlns:o="urn:schemas-microsoft-com:office:office" xmlns:oel="http://schemas.microsoft.com/office/2019/extlst" xmlns:r="http://schemas.openxmlformats.org/officeDocument/2006/relationships" xmlns:m="http://schemas.openxmlformats.org/officeDocument/2006/math" xmlns:v="urn:schemas-microsoft-com:vml" xmlns:wp14="http://schemas.microsoft.com/office/word/2010/wordprocessingDrawing" xmlns:wp="http://schemas.openxmlformats.org/drawingml/2006/wordprocessingDrawing" xmlns:w10="urn:schemas-microsoft-com:office:word" xmlns:w="http://schemas.openxmlformats.org/wordprocessingml/2006/main" xmlns:w14="http://schemas.microsoft.com/office/word/2010/wordml" xmlns:w15="http://schemas.microsoft.com/office/word/2012/wordml" xmlns:w16cex="http://schemas.microsoft.com/office/word/2018/wordml/cex" xmlns:w16cid="http://schemas.microsoft.com/office/word/2016/wordml/cid" xmlns:w16="http://schemas.microsoft.com/office/word/2018/wordml" xmlns:w16sdtdh="http://schemas.microsoft.com/office/word/2020/wordml/sdtdatahash" xmlns:w16se="http://schemas.microsoft.com/office/word/2015/wordml/symex" xmlns:wpg="http://schemas.microsoft.com/office/word/2010/wordprocessingGroup" xmlns:wpi="http://schemas.microsoft.com/office/word/2010/wordprocessingInk" xmlns:wne="http://schemas.microsoft.com/office/word/2006/wordml" xmlns:wps="http://schemas.microsoft.com/office/word/2010/wordprocessingShape" mc:Ignorable="w14 w15 w16se w16cid w16 w16cex w16sdtdh wp14">
+<w:hdr xmlns:wpc="http://schemas.microsoft.com/office/word/2010/wordprocessingCanvas" xmlns:cx="http://schemas.microsoft.com/office/drawing/2014/chartex" xmlns:cx1="http://schemas.microsoft.com/office/drawing/2015/9/8/chartex" xmlns:cx2="http://schemas.microsoft.com/office/drawing/2015/10/21/chartex" xmlns:cx3="http://schemas.microsoft.com/office/drawing/2016/5/9/chartex" xmlns:cx4="http://schemas.microsoft.com/office/drawing/2016/5/10/chartex" xmlns:cx5="http://schemas.microsoft.com/office/drawing/2016/5/11/chartex" xmlns:cx6="http://schemas.microsoft.com/office/drawing/2016/5/12/chartex" xmlns:cx7="http://schemas.microsoft.com/office/drawing/2016/5/13/chartex" xmlns:cx8="http://schemas.microsoft.com/office/drawing/2016/5/14/chartex" xmlns:mc="http://schemas.openxmlformats.org/markup-compatibility/2006" xmlns:aink="http://schemas.microsoft.com/office/drawing/2016/ink" xmlns:am3d="http://schemas.microsoft.com/office/drawing/2017/model3d" xmlns:o="urn:schemas-microsoft-com:office:office" xmlns:oel="http://schemas.microsoft.com/office/2019/extlst" xmlns:r="http://schemas.openxmlformats.org/officeDocument/2006/relationships" xmlns:m="http://schemas.openxmlformats.org/officeDocument/2006/math" xmlns:v="urn:schemas-microsoft-com:vml" xmlns:wp14="http://schemas.microsoft.com/office/word/2010/wordprocessingDrawing" xmlns:wp="http://schemas.openxmlformats.org/drawingml/2006/wordprocessingDrawing" xmlns:w10="urn:schemas-microsoft-com:office:word" xmlns:w="http://schemas.openxmlformats.org/wordprocessingml/2006/main" xmlns:w14="http://schemas.microsoft.com/office/word/2010/wordml" xmlns:w15="http://schemas.microsoft.com/office/word/2012/wordml" xmlns:w16cex="http://schemas.microsoft.com/office/word/2018/wordml/cex" xmlns:w16cid="http://schemas.microsoft.com/office/word/2016/wordml/cid" xmlns:w16="http://schemas.microsoft.com/office/word/2018/wordml" xmlns:w16du="http://schemas.microsoft.com/office/word/2023/wordml/word16du" xmlns:w16sdtdh="http://schemas.microsoft.com/office/word/2020/wordml/sdtdatahash" xmlns:w16sdtfl="http://schemas.microsoft.com/office/word/2024/wordml/sdtformatlock" xmlns:w16se="http://schemas.microsoft.com/office/word/2015/wordml/symex" xmlns:wpg="http://schemas.microsoft.com/office/word/2010/wordprocessingGroup" xmlns:wpi="http://schemas.microsoft.com/office/word/2010/wordprocessingInk" xmlns:wne="http://schemas.microsoft.com/office/word/2006/wordml" xmlns:wps="http://schemas.microsoft.com/office/word/2010/wordprocessingShape" mc:Ignorable="w14 w15 w16se w16cid w16 w16cex w16sdtdh w16sdtfl w16du wp14">
   <w:p>
     <w:pPr>
       <w:pStyle w:val="Logo-Org"/>
@@ -43770,7 +43579,7 @@
 </file>
 
 <file path=word/numbering.xml><?xml version="1.0" encoding="utf-8"?>
-<w:numbering xmlns:wpc="http://schemas.microsoft.com/office/word/2010/wordprocessingCanvas" xmlns:cx="http://schemas.microsoft.com/office/drawing/2014/chartex" xmlns:cx1="http://schemas.microsoft.com/office/drawing/2015/9/8/chartex" xmlns:cx2="http://schemas.microsoft.com/office/drawing/2015/10/21/chartex" xmlns:cx3="http://schemas.microsoft.com/office/drawing/2016/5/9/chartex" xmlns:cx4="http://schemas.microsoft.com/office/drawing/2016/5/10/chartex" xmlns:cx5="http://schemas.microsoft.com/office/drawing/2016/5/11/chartex" xmlns:cx6="http://schemas.microsoft.com/office/drawing/2016/5/12/chartex" xmlns:cx7="http://schemas.microsoft.com/office/drawing/2016/5/13/chartex" xmlns:cx8="http://schemas.microsoft.com/office/drawing/2016/5/14/chartex" xmlns:mc="http://schemas.openxmlformats.org/markup-compatibility/2006" xmlns:aink="http://schemas.microsoft.com/office/drawing/2016/ink" xmlns:am3d="http://schemas.microsoft.com/office/drawing/2017/model3d" xmlns:o="urn:schemas-microsoft-com:office:office" xmlns:oel="http://schemas.microsoft.com/office/2019/extlst" xmlns:r="http://schemas.openxmlformats.org/officeDocument/2006/relationships" xmlns:m="http://schemas.openxmlformats.org/officeDocument/2006/math" xmlns:v="urn:schemas-microsoft-com:vml" xmlns:wp14="http://schemas.microsoft.com/office/word/2010/wordprocessingDrawing" xmlns:wp="http://schemas.openxmlformats.org/drawingml/2006/wordprocessingDrawing" xmlns:w10="urn:schemas-microsoft-com:office:word" xmlns:w="http://schemas.openxmlformats.org/wordprocessingml/2006/main" xmlns:w14="http://schemas.microsoft.com/office/word/2010/wordml" xmlns:w15="http://schemas.microsoft.com/office/word/2012/wordml" xmlns:w16cex="http://schemas.microsoft.com/office/word/2018/wordml/cex" xmlns:w16cid="http://schemas.microsoft.com/office/word/2016/wordml/cid" xmlns:w16="http://schemas.microsoft.com/office/word/2018/wordml" xmlns:w16sdtdh="http://schemas.microsoft.com/office/word/2020/wordml/sdtdatahash" xmlns:w16se="http://schemas.microsoft.com/office/word/2015/wordml/symex" xmlns:wpg="http://schemas.microsoft.com/office/word/2010/wordprocessingGroup" xmlns:wpi="http://schemas.microsoft.com/office/word/2010/wordprocessingInk" xmlns:wne="http://schemas.microsoft.com/office/word/2006/wordml" xmlns:wps="http://schemas.microsoft.com/office/word/2010/wordprocessingShape" mc:Ignorable="w14 w15 w16se w16cid w16 w16cex w16sdtdh wp14">
+<w:numbering xmlns:wpc="http://schemas.microsoft.com/office/word/2010/wordprocessingCanvas" xmlns:cx="http://schemas.microsoft.com/office/drawing/2014/chartex" xmlns:cx1="http://schemas.microsoft.com/office/drawing/2015/9/8/chartex" xmlns:cx2="http://schemas.microsoft.com/office/drawing/2015/10/21/chartex" xmlns:cx3="http://schemas.microsoft.com/office/drawing/2016/5/9/chartex" xmlns:cx4="http://schemas.microsoft.com/office/drawing/2016/5/10/chartex" xmlns:cx5="http://schemas.microsoft.com/office/drawing/2016/5/11/chartex" xmlns:cx6="http://schemas.microsoft.com/office/drawing/2016/5/12/chartex" xmlns:cx7="http://schemas.microsoft.com/office/drawing/2016/5/13/chartex" xmlns:cx8="http://schemas.microsoft.com/office/drawing/2016/5/14/chartex" xmlns:mc="http://schemas.openxmlformats.org/markup-compatibility/2006" xmlns:aink="http://schemas.microsoft.com/office/drawing/2016/ink" xmlns:am3d="http://schemas.microsoft.com/office/drawing/2017/model3d" xmlns:o="urn:schemas-microsoft-com:office:office" xmlns:oel="http://schemas.microsoft.com/office/2019/extlst" xmlns:r="http://schemas.openxmlformats.org/officeDocument/2006/relationships" xmlns:m="http://schemas.openxmlformats.org/officeDocument/2006/math" xmlns:v="urn:schemas-microsoft-com:vml" xmlns:wp14="http://schemas.microsoft.com/office/word/2010/wordprocessingDrawing" xmlns:wp="http://schemas.openxmlformats.org/drawingml/2006/wordprocessingDrawing" xmlns:w10="urn:schemas-microsoft-com:office:word" xmlns:w="http://schemas.openxmlformats.org/wordprocessingml/2006/main" xmlns:w14="http://schemas.microsoft.com/office/word/2010/wordml" xmlns:w15="http://schemas.microsoft.com/office/word/2012/wordml" xmlns:w16cex="http://schemas.microsoft.com/office/word/2018/wordml/cex" xmlns:w16cid="http://schemas.microsoft.com/office/word/2016/wordml/cid" xmlns:w16="http://schemas.microsoft.com/office/word/2018/wordml" xmlns:w16du="http://schemas.microsoft.com/office/word/2023/wordml/word16du" xmlns:w16sdtdh="http://schemas.microsoft.com/office/word/2020/wordml/sdtdatahash" xmlns:w16sdtfl="http://schemas.microsoft.com/office/word/2024/wordml/sdtformatlock" xmlns:w16se="http://schemas.microsoft.com/office/word/2015/wordml/symex" xmlns:wpg="http://schemas.microsoft.com/office/word/2010/wordprocessingGroup" xmlns:wpi="http://schemas.microsoft.com/office/word/2010/wordprocessingInk" xmlns:wne="http://schemas.microsoft.com/office/word/2006/wordml" xmlns:wps="http://schemas.microsoft.com/office/word/2010/wordprocessingShape" mc:Ignorable="w14 w15 w16se w16cid w16 w16cex w16sdtdh w16sdtfl w16du wp14">
   <w:abstractNum w:abstractNumId="0" w15:restartNumberingAfterBreak="0">
     <w:nsid w:val="0E4E726C"/>
     <w:multiLevelType w:val="hybridMultilevel"/>
@@ -45371,7 +45180,7 @@
 </file>
 
 <file path=word/styles.xml><?xml version="1.0" encoding="utf-8"?>
-<w:styles xmlns:mc="http://schemas.openxmlformats.org/markup-compatibility/2006" xmlns:r="http://schemas.openxmlformats.org/officeDocument/2006/relationships" xmlns:w="http://schemas.openxmlformats.org/wordprocessingml/2006/main" xmlns:w14="http://schemas.microsoft.com/office/word/2010/wordml" xmlns:w15="http://schemas.microsoft.com/office/word/2012/wordml" xmlns:w16cex="http://schemas.microsoft.com/office/word/2018/wordml/cex" xmlns:w16cid="http://schemas.microsoft.com/office/word/2016/wordml/cid" xmlns:w16="http://schemas.microsoft.com/office/word/2018/wordml" xmlns:w16sdtdh="http://schemas.microsoft.com/office/word/2020/wordml/sdtdatahash" xmlns:w16se="http://schemas.microsoft.com/office/word/2015/wordml/symex" mc:Ignorable="w14 w15 w16se w16cid w16 w16cex w16sdtdh">
+<w:styles xmlns:mc="http://schemas.openxmlformats.org/markup-compatibility/2006" xmlns:r="http://schemas.openxmlformats.org/officeDocument/2006/relationships" xmlns:w="http://schemas.openxmlformats.org/wordprocessingml/2006/main" xmlns:w14="http://schemas.microsoft.com/office/word/2010/wordml" xmlns:w15="http://schemas.microsoft.com/office/word/2012/wordml" xmlns:w16cex="http://schemas.microsoft.com/office/word/2018/wordml/cex" xmlns:w16cid="http://schemas.microsoft.com/office/word/2016/wordml/cid" xmlns:w16="http://schemas.microsoft.com/office/word/2018/wordml" xmlns:w16du="http://schemas.microsoft.com/office/word/2023/wordml/word16du" xmlns:w16sdtdh="http://schemas.microsoft.com/office/word/2020/wordml/sdtdatahash" xmlns:w16sdtfl="http://schemas.microsoft.com/office/word/2024/wordml/sdtformatlock" xmlns:w16se="http://schemas.microsoft.com/office/word/2015/wordml/symex" mc:Ignorable="w14 w15 w16se w16cid w16 w16cex w16sdtdh w16sdtfl w16du">
   <w:docDefaults>
     <w:rPrDefault>
       <w:rPr>
@@ -47728,15 +47537,81 @@
 </file>
 
 <file path=customXml/item1.xml><?xml version="1.0" encoding="utf-8"?>
-<?mso-contentType ?>
-<FormTemplates xmlns="http://schemas.microsoft.com/sharepoint/v3/contenttype/forms">
-  <Display>DocumentLibraryForm</Display>
-  <Edit>DocumentLibraryForm</Edit>
-  <New>DocumentLibraryForm</New>
-</FormTemplates>
+<p:properties xmlns:p="http://schemas.microsoft.com/office/2006/metadata/properties" xmlns:xsi="http://www.w3.org/2001/XMLSchema-instance" xmlns:pc="http://schemas.microsoft.com/office/infopath/2007/PartnerControls">
+  <documentManagement>
+    <_ip_UnifiedCompliancePolicyProperties xmlns="http://schemas.microsoft.com/sharepoint/v3" xsi:nil="true"/>
+    <_ip_UnifiedCompliancePolicyUIAction xmlns="http://schemas.microsoft.com/sharepoint/v3" xsi:nil="true"/>
+    <lcf76f155ced4ddcb4097134ff3c332f xmlns="139127ee-9518-45d9-9514-77dc8f273ced">
+      <Terms xmlns="http://schemas.microsoft.com/office/infopath/2007/PartnerControls"/>
+    </lcf76f155ced4ddcb4097134ff3c332f>
+    <_x0020_ xmlns="139127ee-9518-45d9-9514-77dc8f273ced" xsi:nil="true"/>
+    <DateandTime xmlns="139127ee-9518-45d9-9514-77dc8f273ced" xsi:nil="true"/>
+    <Comment xmlns="139127ee-9518-45d9-9514-77dc8f273ced" xsi:nil="true"/>
+    <TaxCatchAll xmlns="d267a1a7-8edd-4111-a118-4a206d87cecc" xsi:nil="true"/>
+    <_dlc_DocId xmlns="e1b0dd96-a81d-477c-8ece-ee9c4f66c737">MOED-597021718-2941</_dlc_DocId>
+    <_dlc_DocIdUrl xmlns="e1b0dd96-a81d-477c-8ece-ee9c4f66c737">
+      <Url>https://educationgovtnz.sharepoint.com/sites/GRPMoEICTTPHMStrengtheningCyberSecurityandDigitalServicesinK/_layouts/15/DocIdRedir.aspx?ID=MOED-597021718-2941</Url>
+      <Description>MOED-597021718-2941</Description>
+    </_dlc_DocIdUrl>
+  </documentManagement>
+</p:properties>
 </file>
 
 <file path=customXml/item2.xml><?xml version="1.0" encoding="utf-8"?>
+<?mso-contentType ?>
+<spe:Receivers xmlns:spe="http://schemas.microsoft.com/sharepoint/events">
+  <Receiver>
+    <Name>Document ID Generator</Name>
+    <Synchronization>Synchronous</Synchronization>
+    <Type>10001</Type>
+    <SequenceNumber>1000</SequenceNumber>
+    <Url/>
+    <Assembly>Microsoft.Office.DocumentManagement, Version=16.0.0.0, Culture=neutral, PublicKeyToken=71e9bce111e9429c</Assembly>
+    <Class>Microsoft.Office.DocumentManagement.Internal.DocIdHandler</Class>
+    <Data/>
+    <Filter/>
+  </Receiver>
+  <Receiver>
+    <Name>Document ID Generator</Name>
+    <Synchronization>Synchronous</Synchronization>
+    <Type>10002</Type>
+    <SequenceNumber>1001</SequenceNumber>
+    <Url/>
+    <Assembly>Microsoft.Office.DocumentManagement, Version=16.0.0.0, Culture=neutral, PublicKeyToken=71e9bce111e9429c</Assembly>
+    <Class>Microsoft.Office.DocumentManagement.Internal.DocIdHandler</Class>
+    <Data/>
+    <Filter/>
+  </Receiver>
+  <Receiver>
+    <Name>Document ID Generator</Name>
+    <Synchronization>Synchronous</Synchronization>
+    <Type>10004</Type>
+    <SequenceNumber>1002</SequenceNumber>
+    <Url/>
+    <Assembly>Microsoft.Office.DocumentManagement, Version=16.0.0.0, Culture=neutral, PublicKeyToken=71e9bce111e9429c</Assembly>
+    <Class>Microsoft.Office.DocumentManagement.Internal.DocIdHandler</Class>
+    <Data/>
+    <Filter/>
+  </Receiver>
+  <Receiver>
+    <Name>Document ID Generator</Name>
+    <Synchronization>Synchronous</Synchronization>
+    <Type>10006</Type>
+    <SequenceNumber>1003</SequenceNumber>
+    <Url/>
+    <Assembly>Microsoft.Office.DocumentManagement, Version=16.0.0.0, Culture=neutral, PublicKeyToken=71e9bce111e9429c</Assembly>
+    <Class>Microsoft.Office.DocumentManagement.Internal.DocIdHandler</Class>
+    <Data/>
+    <Filter/>
+  </Receiver>
+</spe:Receivers>
+</file>
+
+<file path=customXml/item3.xml><?xml version="1.0" encoding="utf-8"?>
+<b:Sources xmlns:b="http://schemas.openxmlformats.org/officeDocument/2006/bibliography" xmlns="http://schemas.openxmlformats.org/officeDocument/2006/bibliography" SelectedStyle="\APASixthEditionOfficeOnline.xsl" StyleName="APA" Version="6"/>
+</file>
+
+<file path=customXml/item4.xml><?xml version="1.0" encoding="utf-8"?>
 <ct:contentTypeSchema xmlns:ct="http://schemas.microsoft.com/office/2006/metadata/contentType" xmlns:ma="http://schemas.microsoft.com/office/2006/metadata/properties/metaAttributes" ct:_="" ma:_="" ma:contentTypeName="Document" ma:contentTypeID="0x010100B480C2AAFAD0314B93110FBA94AF803E" ma:contentTypeVersion="19" ma:contentTypeDescription="Create a new document." ma:contentTypeScope="" ma:versionID="74a3b9bfef33761f57034edf28b9506d">
   <xsd:schema xmlns:xsd="http://www.w3.org/2001/XMLSchema" xmlns:xs="http://www.w3.org/2001/XMLSchema" xmlns:p="http://schemas.microsoft.com/office/2006/metadata/properties" xmlns:ns1="http://schemas.microsoft.com/sharepoint/v3" xmlns:ns2="139127ee-9518-45d9-9514-77dc8f273ced" xmlns:ns3="e1b0dd96-a81d-477c-8ece-ee9c4f66c737" xmlns:ns4="d267a1a7-8edd-4111-a118-4a206d87cecc" targetNamespace="http://schemas.microsoft.com/office/2006/metadata/properties" ma:root="true" ma:fieldsID="ffc9e1ae2e65d33f32ce329a3d87134b" ns1:_="" ns2:_="" ns3:_="" ns4:_="">
     <xsd:import namespace="http://schemas.microsoft.com/sharepoint/v3"/>
@@ -48034,90 +47909,45 @@
 </ct:contentTypeSchema>
 </file>
 
-<file path=customXml/item3.xml><?xml version="1.0" encoding="utf-8"?>
-<b:Sources xmlns:b="http://schemas.openxmlformats.org/officeDocument/2006/bibliography" xmlns="http://schemas.openxmlformats.org/officeDocument/2006/bibliography" SelectedStyle="\APASixthEditionOfficeOnline.xsl" StyleName="APA" Version="6"/>
-</file>
-
-<file path=customXml/item4.xml><?xml version="1.0" encoding="utf-8"?>
+<file path=customXml/item5.xml><?xml version="1.0" encoding="utf-8"?>
 <?mso-contentType ?>
-<spe:Receivers xmlns:spe="http://schemas.microsoft.com/sharepoint/events">
-  <Receiver>
-    <Name>Document ID Generator</Name>
-    <Synchronization>Synchronous</Synchronization>
-    <Type>10001</Type>
-    <SequenceNumber>1000</SequenceNumber>
-    <Url/>
-    <Assembly>Microsoft.Office.DocumentManagement, Version=16.0.0.0, Culture=neutral, PublicKeyToken=71e9bce111e9429c</Assembly>
-    <Class>Microsoft.Office.DocumentManagement.Internal.DocIdHandler</Class>
-    <Data/>
-    <Filter/>
-  </Receiver>
-  <Receiver>
-    <Name>Document ID Generator</Name>
-    <Synchronization>Synchronous</Synchronization>
-    <Type>10002</Type>
-    <SequenceNumber>1001</SequenceNumber>
-    <Url/>
-    <Assembly>Microsoft.Office.DocumentManagement, Version=16.0.0.0, Culture=neutral, PublicKeyToken=71e9bce111e9429c</Assembly>
-    <Class>Microsoft.Office.DocumentManagement.Internal.DocIdHandler</Class>
-    <Data/>
-    <Filter/>
-  </Receiver>
-  <Receiver>
-    <Name>Document ID Generator</Name>
-    <Synchronization>Synchronous</Synchronization>
-    <Type>10004</Type>
-    <SequenceNumber>1002</SequenceNumber>
-    <Url/>
-    <Assembly>Microsoft.Office.DocumentManagement, Version=16.0.0.0, Culture=neutral, PublicKeyToken=71e9bce111e9429c</Assembly>
-    <Class>Microsoft.Office.DocumentManagement.Internal.DocIdHandler</Class>
-    <Data/>
-    <Filter/>
-  </Receiver>
-  <Receiver>
-    <Name>Document ID Generator</Name>
-    <Synchronization>Synchronous</Synchronization>
-    <Type>10006</Type>
-    <SequenceNumber>1003</SequenceNumber>
-    <Url/>
-    <Assembly>Microsoft.Office.DocumentManagement, Version=16.0.0.0, Culture=neutral, PublicKeyToken=71e9bce111e9429c</Assembly>
-    <Class>Microsoft.Office.DocumentManagement.Internal.DocIdHandler</Class>
-    <Data/>
-    <Filter/>
-  </Receiver>
-</spe:Receivers>
-</file>
-
-<file path=customXml/item5.xml><?xml version="1.0" encoding="utf-8"?>
-<p:properties xmlns:p="http://schemas.microsoft.com/office/2006/metadata/properties" xmlns:xsi="http://www.w3.org/2001/XMLSchema-instance" xmlns:pc="http://schemas.microsoft.com/office/infopath/2007/PartnerControls">
-  <documentManagement>
-    <_ip_UnifiedCompliancePolicyProperties xmlns="http://schemas.microsoft.com/sharepoint/v3" xsi:nil="true"/>
-    <_ip_UnifiedCompliancePolicyUIAction xmlns="http://schemas.microsoft.com/sharepoint/v3" xsi:nil="true"/>
-    <lcf76f155ced4ddcb4097134ff3c332f xmlns="139127ee-9518-45d9-9514-77dc8f273ced">
-      <Terms xmlns="http://schemas.microsoft.com/office/infopath/2007/PartnerControls"/>
-    </lcf76f155ced4ddcb4097134ff3c332f>
-    <_x0020_ xmlns="139127ee-9518-45d9-9514-77dc8f273ced" xsi:nil="true"/>
-    <DateandTime xmlns="139127ee-9518-45d9-9514-77dc8f273ced" xsi:nil="true"/>
-    <Comment xmlns="139127ee-9518-45d9-9514-77dc8f273ced" xsi:nil="true"/>
-    <TaxCatchAll xmlns="d267a1a7-8edd-4111-a118-4a206d87cecc" xsi:nil="true"/>
-    <_dlc_DocId xmlns="e1b0dd96-a81d-477c-8ece-ee9c4f66c737">MOED-597021718-2941</_dlc_DocId>
-    <_dlc_DocIdUrl xmlns="e1b0dd96-a81d-477c-8ece-ee9c4f66c737">
-      <Url>https://educationgovtnz.sharepoint.com/sites/GRPMoEICTTPHMStrengtheningCyberSecurityandDigitalServicesinK/_layouts/15/DocIdRedir.aspx?ID=MOED-597021718-2941</Url>
-      <Description>MOED-597021718-2941</Description>
-    </_dlc_DocIdUrl>
-  </documentManagement>
-</p:properties>
+<FormTemplates xmlns="http://schemas.microsoft.com/sharepoint/v3/contenttype/forms">
+  <Display>DocumentLibraryForm</Display>
+  <Edit>DocumentLibraryForm</Edit>
+  <New>DocumentLibraryForm</New>
+</FormTemplates>
 </file>
 
 <file path=customXml/itemProps1.xml><?xml version="1.0" encoding="utf-8"?>
-<ds:datastoreItem xmlns:ds="http://schemas.openxmlformats.org/officeDocument/2006/customXml" ds:itemID="{9834B279-DC96-488F-99E8-C29601DFA13D}">
+<ds:datastoreItem xmlns:ds="http://schemas.openxmlformats.org/officeDocument/2006/customXml" ds:itemID="{6702286D-F273-4089-9CAA-235928BAA15D}">
   <ds:schemaRefs>
-    <ds:schemaRef ds:uri="http://schemas.microsoft.com/sharepoint/v3/contenttype/forms"/>
+    <ds:schemaRef ds:uri="http://schemas.microsoft.com/office/2006/metadata/properties"/>
+    <ds:schemaRef ds:uri="http://schemas.microsoft.com/office/infopath/2007/PartnerControls"/>
+    <ds:schemaRef ds:uri="http://schemas.microsoft.com/sharepoint/v3"/>
+    <ds:schemaRef ds:uri="139127ee-9518-45d9-9514-77dc8f273ced"/>
+    <ds:schemaRef ds:uri="d267a1a7-8edd-4111-a118-4a206d87cecc"/>
+    <ds:schemaRef ds:uri="e1b0dd96-a81d-477c-8ece-ee9c4f66c737"/>
   </ds:schemaRefs>
 </ds:datastoreItem>
 </file>
 
 <file path=customXml/itemProps2.xml><?xml version="1.0" encoding="utf-8"?>
+<ds:datastoreItem xmlns:ds="http://schemas.openxmlformats.org/officeDocument/2006/customXml" ds:itemID="{2023D3F9-1C64-4968-82D7-149C6251DAD6}">
+  <ds:schemaRefs>
+    <ds:schemaRef ds:uri="http://schemas.microsoft.com/sharepoint/events"/>
+  </ds:schemaRefs>
+</ds:datastoreItem>
+</file>
+
+<file path=customXml/itemProps3.xml><?xml version="1.0" encoding="utf-8"?>
+<ds:datastoreItem xmlns:ds="http://schemas.openxmlformats.org/officeDocument/2006/customXml" ds:itemID="{B5E2C1A7-32A2-494A-B871-83CBA7258EA8}">
+  <ds:schemaRefs>
+    <ds:schemaRef ds:uri="http://schemas.openxmlformats.org/officeDocument/2006/bibliography"/>
+  </ds:schemaRefs>
+</ds:datastoreItem>
+</file>
+
+<file path=customXml/itemProps4.xml><?xml version="1.0" encoding="utf-8"?>
 <ds:datastoreItem xmlns:ds="http://schemas.openxmlformats.org/officeDocument/2006/customXml" ds:itemID="{A92CC428-19C8-41A4-8077-F0319381BD4C}">
   <ds:schemaRefs>
     <ds:schemaRef ds:uri="http://schemas.microsoft.com/office/2006/metadata/contentType"/>
@@ -48138,31 +47968,10 @@
 </ds:datastoreItem>
 </file>
 
-<file path=customXml/itemProps3.xml><?xml version="1.0" encoding="utf-8"?>
-<ds:datastoreItem xmlns:ds="http://schemas.openxmlformats.org/officeDocument/2006/customXml" ds:itemID="{B5E2C1A7-32A2-494A-B871-83CBA7258EA8}">
+<file path=customXml/itemProps5.xml><?xml version="1.0" encoding="utf-8"?>
+<ds:datastoreItem xmlns:ds="http://schemas.openxmlformats.org/officeDocument/2006/customXml" ds:itemID="{9834B279-DC96-488F-99E8-C29601DFA13D}">
   <ds:schemaRefs>
-    <ds:schemaRef ds:uri="http://schemas.openxmlformats.org/officeDocument/2006/bibliography"/>
-  </ds:schemaRefs>
-</ds:datastoreItem>
-</file>
-
-<file path=customXml/itemProps4.xml><?xml version="1.0" encoding="utf-8"?>
-<ds:datastoreItem xmlns:ds="http://schemas.openxmlformats.org/officeDocument/2006/customXml" ds:itemID="{2023D3F9-1C64-4968-82D7-149C6251DAD6}">
-  <ds:schemaRefs>
-    <ds:schemaRef ds:uri="http://schemas.microsoft.com/sharepoint/events"/>
-  </ds:schemaRefs>
-</ds:datastoreItem>
-</file>
-
-<file path=customXml/itemProps5.xml><?xml version="1.0" encoding="utf-8"?>
-<ds:datastoreItem xmlns:ds="http://schemas.openxmlformats.org/officeDocument/2006/customXml" ds:itemID="{6702286D-F273-4089-9CAA-235928BAA15D}">
-  <ds:schemaRefs>
-    <ds:schemaRef ds:uri="http://schemas.microsoft.com/office/2006/metadata/properties"/>
-    <ds:schemaRef ds:uri="http://schemas.microsoft.com/office/infopath/2007/PartnerControls"/>
-    <ds:schemaRef ds:uri="http://schemas.microsoft.com/sharepoint/v3"/>
-    <ds:schemaRef ds:uri="139127ee-9518-45d9-9514-77dc8f273ced"/>
-    <ds:schemaRef ds:uri="d267a1a7-8edd-4111-a118-4a206d87cecc"/>
-    <ds:schemaRef ds:uri="e1b0dd96-a81d-477c-8ece-ee9c4f66c737"/>
+    <ds:schemaRef ds:uri="http://schemas.microsoft.com/sharepoint/v3/contenttype/forms"/>
   </ds:schemaRefs>
 </ds:datastoreItem>
 </file>
</xml_diff>